<commit_message>
segunda vercion del manual
</commit_message>
<xml_diff>
--- a/Manual de usuario de esp32 segunda vercion.docx
+++ b/Manual de usuario de esp32 segunda vercion.docx
@@ -1,6 +1,6 @@
 
 <file path=word/document.xml><?xml version="1.0" encoding="utf-8"?>
-<w:document xmlns:wpc="http://schemas.microsoft.com/office/word/2010/wordprocessingCanvas" xmlns:cx="http://schemas.microsoft.com/office/drawing/2014/chartex" xmlns:mc="http://schemas.openxmlformats.org/markup-compatibility/2006" xmlns:o="urn:schemas-microsoft-com:office:office" xmlns:r="http://schemas.openxmlformats.org/officeDocument/2006/relationships" xmlns:m="http://schemas.openxmlformats.org/officeDocument/2006/math" xmlns:v="urn:schemas-microsoft-com:vml" xmlns:wp14="http://schemas.microsoft.com/office/word/2010/wordprocessingDrawing" xmlns:wp="http://schemas.openxmlformats.org/drawingml/2006/wordprocessingDrawing" xmlns:w10="urn:schemas-microsoft-com:office:word" xmlns:w="http://schemas.openxmlformats.org/wordprocessingml/2006/main" xmlns:w14="http://schemas.microsoft.com/office/word/2010/wordml" xmlns:w15="http://schemas.microsoft.com/office/word/2012/wordml" xmlns:w16se="http://schemas.microsoft.com/office/word/2015/wordml/symex" xmlns:wpg="http://schemas.microsoft.com/office/word/2010/wordprocessingGroup" xmlns:wpi="http://schemas.microsoft.com/office/word/2010/wordprocessingInk" xmlns:wne="http://schemas.microsoft.com/office/word/2006/wordml" xmlns:wps="http://schemas.microsoft.com/office/word/2010/wordprocessingShape" mc:Ignorable="w14 w15 w16se wp14">
+<w:document xmlns:wpc="http://schemas.microsoft.com/office/word/2010/wordprocessingCanvas" xmlns:cx="http://schemas.microsoft.com/office/drawing/2014/chartex" xmlns:cx1="http://schemas.microsoft.com/office/drawing/2015/9/8/chartex" xmlns:cx2="http://schemas.microsoft.com/office/drawing/2015/10/21/chartex" xmlns:cx3="http://schemas.microsoft.com/office/drawing/2016/5/9/chartex" xmlns:cx4="http://schemas.microsoft.com/office/drawing/2016/5/10/chartex" xmlns:cx5="http://schemas.microsoft.com/office/drawing/2016/5/11/chartex" xmlns:cx6="http://schemas.microsoft.com/office/drawing/2016/5/12/chartex" xmlns:cx7="http://schemas.microsoft.com/office/drawing/2016/5/13/chartex" xmlns:cx8="http://schemas.microsoft.com/office/drawing/2016/5/14/chartex" xmlns:mc="http://schemas.openxmlformats.org/markup-compatibility/2006" xmlns:aink="http://schemas.microsoft.com/office/drawing/2016/ink" xmlns:am3d="http://schemas.microsoft.com/office/drawing/2017/model3d" xmlns:o="urn:schemas-microsoft-com:office:office" xmlns:r="http://schemas.openxmlformats.org/officeDocument/2006/relationships" xmlns:m="http://schemas.openxmlformats.org/officeDocument/2006/math" xmlns:v="urn:schemas-microsoft-com:vml" xmlns:wp14="http://schemas.microsoft.com/office/word/2010/wordprocessingDrawing" xmlns:wp="http://schemas.openxmlformats.org/drawingml/2006/wordprocessingDrawing" xmlns:w10="urn:schemas-microsoft-com:office:word" xmlns:w="http://schemas.openxmlformats.org/wordprocessingml/2006/main" xmlns:w14="http://schemas.microsoft.com/office/word/2010/wordml" xmlns:w15="http://schemas.microsoft.com/office/word/2012/wordml" xmlns:w16cex="http://schemas.microsoft.com/office/word/2018/wordml/cex" xmlns:w16cid="http://schemas.microsoft.com/office/word/2016/wordml/cid" xmlns:w16="http://schemas.microsoft.com/office/word/2018/wordml" xmlns:w16sdtdh="http://schemas.microsoft.com/office/word/2020/wordml/sdtdatahash" xmlns:w16se="http://schemas.microsoft.com/office/word/2015/wordml/symex" xmlns:wpg="http://schemas.microsoft.com/office/word/2010/wordprocessingGroup" xmlns:wpi="http://schemas.microsoft.com/office/word/2010/wordprocessingInk" xmlns:wne="http://schemas.microsoft.com/office/word/2006/wordml" xmlns:wps="http://schemas.microsoft.com/office/word/2010/wordprocessingShape" mc:Ignorable="w14 w15 w16se w16cid w16 w16cex w16sdtdh wp14">
   <w:body>
     <w:p/>
     <w:p>
@@ -262,32 +262,34 @@
           <w:sz w:val="24"/>
           <w:szCs w:val="24"/>
         </w:rPr>
-        <w:t>Instructor. Franco Antonio Reina Argoty</w:t>
-      </w:r>
-    </w:p>
-    <w:p>
-      <w:pPr>
-        <w:tabs>
-          <w:tab w:val="center" w:pos="4680"/>
-        </w:tabs>
-        <w:spacing w:line="480" w:lineRule="auto"/>
-        <w:jc w:val="center"/>
+        <w:t xml:space="preserve">Instructor. Franco Antonio Reina </w:t>
+      </w:r>
+      <w:proofErr w:type="spellStart"/>
+      <w:r>
         <w:rPr>
           <w:rFonts w:ascii="Times New Roman" w:hAnsi="Times New Roman" w:cs="Times New Roman"/>
           <w:color w:val="0D0D0D" w:themeColor="text1" w:themeTint="F2"/>
           <w:sz w:val="24"/>
           <w:szCs w:val="24"/>
         </w:rPr>
-      </w:pPr>
-      <w:r>
+        <w:t>Argoty</w:t>
+      </w:r>
+      <w:proofErr w:type="spellEnd"/>
+    </w:p>
+    <w:p>
+      <w:pPr>
+        <w:tabs>
+          <w:tab w:val="center" w:pos="4680"/>
+        </w:tabs>
+        <w:spacing w:line="480" w:lineRule="auto"/>
+        <w:jc w:val="center"/>
         <w:rPr>
           <w:rFonts w:ascii="Times New Roman" w:hAnsi="Times New Roman" w:cs="Times New Roman"/>
           <w:color w:val="0D0D0D" w:themeColor="text1" w:themeTint="F2"/>
           <w:sz w:val="24"/>
           <w:szCs w:val="24"/>
         </w:rPr>
-        <w:t>23</w:t>
-      </w:r>
+      </w:pPr>
       <w:r>
         <w:rPr>
           <w:rFonts w:ascii="Times New Roman" w:hAnsi="Times New Roman" w:cs="Times New Roman"/>
@@ -295,7 +297,7 @@
           <w:sz w:val="24"/>
           <w:szCs w:val="24"/>
         </w:rPr>
-        <w:t xml:space="preserve"> de</w:t>
+        <w:t>23</w:t>
       </w:r>
       <w:r>
         <w:rPr>
@@ -304,23 +306,17 @@
           <w:sz w:val="24"/>
           <w:szCs w:val="24"/>
         </w:rPr>
-        <w:t xml:space="preserve"> septiembre de 2024</w:t>
-      </w:r>
-    </w:p>
-    <w:p>
-      <w:pPr>
-        <w:tabs>
-          <w:tab w:val="center" w:pos="4680"/>
-        </w:tabs>
-        <w:spacing w:line="480" w:lineRule="auto"/>
-        <w:jc w:val="center"/>
+        <w:t xml:space="preserve"> de</w:t>
+      </w:r>
+      <w:r>
         <w:rPr>
           <w:rFonts w:ascii="Times New Roman" w:hAnsi="Times New Roman" w:cs="Times New Roman"/>
           <w:color w:val="0D0D0D" w:themeColor="text1" w:themeTint="F2"/>
           <w:sz w:val="24"/>
           <w:szCs w:val="24"/>
         </w:rPr>
-      </w:pPr>
+        <w:t xml:space="preserve"> septiembre de 2024</w:t>
+      </w:r>
     </w:p>
     <w:p>
       <w:pPr>
@@ -339,6 +335,21 @@
     </w:p>
     <w:p>
       <w:pPr>
+        <w:tabs>
+          <w:tab w:val="center" w:pos="4680"/>
+        </w:tabs>
+        <w:spacing w:line="480" w:lineRule="auto"/>
+        <w:jc w:val="center"/>
+        <w:rPr>
+          <w:rFonts w:ascii="Times New Roman" w:hAnsi="Times New Roman" w:cs="Times New Roman"/>
+          <w:color w:val="0D0D0D" w:themeColor="text1" w:themeTint="F2"/>
+          <w:sz w:val="24"/>
+          <w:szCs w:val="24"/>
+        </w:rPr>
+      </w:pPr>
+    </w:p>
+    <w:p>
+      <w:pPr>
         <w:pStyle w:val="Estiloa"/>
       </w:pPr>
       <w:r>
@@ -357,7 +368,15 @@
         <w:t>a</w:t>
       </w:r>
       <w:r>
-        <w:t xml:space="preserve"> segunda vercion)</w:t>
+        <w:t xml:space="preserve"> segunda </w:t>
+      </w:r>
+      <w:proofErr w:type="spellStart"/>
+      <w:r>
+        <w:t>vercion</w:t>
+      </w:r>
+      <w:proofErr w:type="spellEnd"/>
+      <w:r>
+        <w:t>)</w:t>
       </w:r>
     </w:p>
     <w:p>
@@ -600,7 +619,7 @@
           <w:szCs w:val="24"/>
           <w:lang w:val="es-CO" w:eastAsia="es-CO"/>
         </w:rPr>
-        <w:t>Instalación de Drivers y Reconocimiento del ESP32</w:t>
+        <w:t>Configuración a español</w:t>
       </w:r>
     </w:p>
     <w:p>
@@ -627,6 +646,33 @@
           <w:szCs w:val="24"/>
           <w:lang w:val="es-CO" w:eastAsia="es-CO"/>
         </w:rPr>
+        <w:t>Instalación de Drivers y Reconocimiento del ESP32</w:t>
+      </w:r>
+    </w:p>
+    <w:p>
+      <w:pPr>
+        <w:widowControl/>
+        <w:numPr>
+          <w:ilvl w:val="1"/>
+          <w:numId w:val="30"/>
+        </w:numPr>
+        <w:autoSpaceDE/>
+        <w:autoSpaceDN/>
+        <w:spacing w:before="100" w:beforeAutospacing="1" w:after="100" w:afterAutospacing="1"/>
+        <w:rPr>
+          <w:rFonts w:ascii="Times New Roman" w:eastAsia="Times New Roman" w:hAnsi="Times New Roman" w:cs="Times New Roman"/>
+          <w:sz w:val="24"/>
+          <w:szCs w:val="24"/>
+          <w:lang w:val="es-CO" w:eastAsia="es-CO"/>
+        </w:rPr>
+      </w:pPr>
+      <w:r>
+        <w:rPr>
+          <w:rFonts w:ascii="Times New Roman" w:eastAsia="Times New Roman" w:hAnsi="Times New Roman" w:cs="Times New Roman"/>
+          <w:sz w:val="24"/>
+          <w:szCs w:val="24"/>
+          <w:lang w:val="es-CO" w:eastAsia="es-CO"/>
+        </w:rPr>
         <w:t>Instalación de Librerías</w:t>
       </w:r>
     </w:p>
@@ -897,7 +943,15 @@
       </w:r>
       <w:r>
         <w:br/>
-        <w:t>Este manual proporciona una guía detallada para configurar y utilizar un proyecto que involucra un ESP32 para enviar datos a MongoDB Atlas y controlarlo mediante una aplicación Flutter.</w:t>
+        <w:t xml:space="preserve">Este manual proporciona una guía detallada para configurar y utilizar un proyecto que involucra un ESP32 para enviar datos a MongoDB Atlas y controlarlo mediante una aplicación </w:t>
+      </w:r>
+      <w:proofErr w:type="spellStart"/>
+      <w:r>
+        <w:t>Flutter</w:t>
+      </w:r>
+      <w:proofErr w:type="spellEnd"/>
+      <w:r>
+        <w:t>.</w:t>
       </w:r>
     </w:p>
     <w:p>
@@ -922,7 +976,15 @@
       </w:r>
       <w:r>
         <w:br/>
-        <w:t>El proyecto utiliza un ESP32 con un sensor DHT11 para recolectar datos de temperatura y humedad. Los datos se envían a MongoDB Atlas y el ESP32 puede ser controlado por una aplicación Flutter para encender o apagar un LED.</w:t>
+        <w:t xml:space="preserve">El proyecto utiliza un ESP32 con un sensor DHT11 para recolectar datos de temperatura y humedad. Los datos se envían a MongoDB Atlas y el ESP32 puede ser controlado por una aplicación </w:t>
+      </w:r>
+      <w:proofErr w:type="spellStart"/>
+      <w:r>
+        <w:t>Flutter</w:t>
+      </w:r>
+      <w:proofErr w:type="spellEnd"/>
+      <w:r>
+        <w:t xml:space="preserve"> para encender o apagar un LED.</w:t>
       </w:r>
     </w:p>
     <w:p>
@@ -994,7 +1056,15 @@
         <w:t>Descripción</w:t>
       </w:r>
       <w:r>
-        <w:t>: Microcontrolador con capacidades Wi-Fi y Bluetooth.</w:t>
+        <w:t xml:space="preserve">: Microcontrolador con capacidades </w:t>
+      </w:r>
+      <w:proofErr w:type="spellStart"/>
+      <w:r>
+        <w:t>Wi</w:t>
+      </w:r>
+      <w:proofErr w:type="spellEnd"/>
+      <w:r>
+        <w:t>-Fi y Bluetooth.</w:t>
       </w:r>
     </w:p>
     <w:p>
@@ -1015,7 +1085,15 @@
         <w:t>Función</w:t>
       </w:r>
       <w:r>
-        <w:t>: Ejecuta el código y gestiona la conexión Wi-Fi, así como el control del LED y la lectura del sensor DHT11.</w:t>
+        <w:t xml:space="preserve">: Ejecuta el código y gestiona la conexión </w:t>
+      </w:r>
+      <w:proofErr w:type="spellStart"/>
+      <w:r>
+        <w:t>Wi</w:t>
+      </w:r>
+      <w:proofErr w:type="spellEnd"/>
+      <w:r>
+        <w:t>-Fi, así como el control del LED y la lectura del sensor DHT11.</w:t>
       </w:r>
     </w:p>
     <w:p>
@@ -1114,7 +1192,15 @@
         <w:t>Descripción</w:t>
       </w:r>
       <w:r>
-        <w:t>: Diodos emisores de luz (LEDs) de diferentes colores.</w:t>
+        <w:t>: Diodos emisores de luz (</w:t>
+      </w:r>
+      <w:proofErr w:type="spellStart"/>
+      <w:r>
+        <w:t>LEDs</w:t>
+      </w:r>
+      <w:proofErr w:type="spellEnd"/>
+      <w:r>
+        <w:t>) de diferentes colores.</w:t>
       </w:r>
     </w:p>
     <w:p>
@@ -1195,7 +1281,15 @@
         <w:t>Función</w:t>
       </w:r>
       <w:r>
-        <w:t>: Protegen los LEDs y el sensor, asegurando que no reciban demasiada corriente.</w:t>
+        <w:t xml:space="preserve">: Protegen los </w:t>
+      </w:r>
+      <w:proofErr w:type="spellStart"/>
+      <w:r>
+        <w:t>LEDs</w:t>
+      </w:r>
+      <w:proofErr w:type="spellEnd"/>
+      <w:r>
+        <w:t xml:space="preserve"> y el sensor, asegurando que no reciban demasiada corriente.</w:t>
       </w:r>
     </w:p>
     <w:p>
@@ -1210,8 +1304,16 @@
         <w:rPr>
           <w:rStyle w:val="Textoennegrita"/>
         </w:rPr>
-        <w:t>Cables y Protoboard</w:t>
-      </w:r>
+        <w:t xml:space="preserve">Cables y </w:t>
+      </w:r>
+      <w:proofErr w:type="spellStart"/>
+      <w:r>
+        <w:rPr>
+          <w:rStyle w:val="Textoennegrita"/>
+        </w:rPr>
+        <w:t>Protoboard</w:t>
+      </w:r>
+      <w:proofErr w:type="spellEnd"/>
       <w:r>
         <w:t>:</w:t>
       </w:r>
@@ -1416,11 +1518,33 @@
         <w:autoSpaceDN/>
         <w:spacing w:before="100" w:beforeAutospacing="1" w:after="100" w:afterAutospacing="1"/>
       </w:pPr>
+      <w:proofErr w:type="spellStart"/>
       <w:r>
         <w:rPr>
           <w:rStyle w:val="Textoennegrita"/>
         </w:rPr>
-        <w:t>Adafruit Unified Sensor</w:t>
+        <w:t>Adafruit</w:t>
+      </w:r>
+      <w:proofErr w:type="spellEnd"/>
+      <w:r>
+        <w:rPr>
+          <w:rStyle w:val="Textoennegrita"/>
+        </w:rPr>
+        <w:t xml:space="preserve"> </w:t>
+      </w:r>
+      <w:proofErr w:type="spellStart"/>
+      <w:r>
+        <w:rPr>
+          <w:rStyle w:val="Textoennegrita"/>
+        </w:rPr>
+        <w:t>Unified</w:t>
+      </w:r>
+      <w:proofErr w:type="spellEnd"/>
+      <w:r>
+        <w:rPr>
+          <w:rStyle w:val="Textoennegrita"/>
+        </w:rPr>
+        <w:t xml:space="preserve"> Sensor</w:t>
       </w:r>
       <w:r>
         <w:t>:</w:t>
@@ -1479,12 +1603,14 @@
         <w:autoSpaceDN/>
         <w:spacing w:before="100" w:beforeAutospacing="1" w:after="100" w:afterAutospacing="1"/>
       </w:pPr>
+      <w:proofErr w:type="spellStart"/>
       <w:r>
         <w:rPr>
           <w:rStyle w:val="Textoennegrita"/>
         </w:rPr>
         <w:t>DHTesp</w:t>
       </w:r>
+      <w:proofErr w:type="spellEnd"/>
       <w:r>
         <w:t>:</w:t>
       </w:r>
@@ -1542,12 +1668,14 @@
         <w:autoSpaceDN/>
         <w:spacing w:before="100" w:beforeAutospacing="1" w:after="100" w:afterAutospacing="1"/>
       </w:pPr>
+      <w:proofErr w:type="spellStart"/>
       <w:r>
         <w:rPr>
           <w:rStyle w:val="Textoennegrita"/>
         </w:rPr>
         <w:t>ArduinoJson</w:t>
       </w:r>
+      <w:proofErr w:type="spellEnd"/>
       <w:r>
         <w:t>:</w:t>
       </w:r>
@@ -1606,8 +1734,16 @@
         <w:rPr>
           <w:rStyle w:val="Textoennegrita"/>
         </w:rPr>
-        <w:t>Librería HTTPClient</w:t>
-      </w:r>
+        <w:t xml:space="preserve">Librería </w:t>
+      </w:r>
+      <w:proofErr w:type="spellStart"/>
+      <w:r>
+        <w:rPr>
+          <w:rStyle w:val="Textoennegrita"/>
+        </w:rPr>
+        <w:t>HTTPClient</w:t>
+      </w:r>
+      <w:proofErr w:type="spellEnd"/>
       <w:r>
         <w:t>:</w:t>
       </w:r>
@@ -1666,7 +1802,21 @@
         <w:rPr>
           <w:rStyle w:val="Textoennegrita"/>
         </w:rPr>
-        <w:t>Configuración de Red Wi-Fi</w:t>
+        <w:t xml:space="preserve">Configuración de Red </w:t>
+      </w:r>
+      <w:proofErr w:type="spellStart"/>
+      <w:r>
+        <w:rPr>
+          <w:rStyle w:val="Textoennegrita"/>
+        </w:rPr>
+        <w:t>Wi</w:t>
+      </w:r>
+      <w:proofErr w:type="spellEnd"/>
+      <w:r>
+        <w:rPr>
+          <w:rStyle w:val="Textoennegrita"/>
+        </w:rPr>
+        <w:t>-Fi</w:t>
       </w:r>
       <w:r>
         <w:t>:</w:t>
@@ -1711,7 +1861,15 @@
         <w:t>Función</w:t>
       </w:r>
       <w:r>
-        <w:t>: Permite al ESP32 conectarse a una red Wi-Fi para enviar datos a la base de datos.</w:t>
+        <w:t xml:space="preserve">: Permite al ESP32 conectarse a una red </w:t>
+      </w:r>
+      <w:proofErr w:type="spellStart"/>
+      <w:r>
+        <w:t>Wi</w:t>
+      </w:r>
+      <w:proofErr w:type="spellEnd"/>
+      <w:r>
+        <w:t>-Fi para enviar datos a la base de datos.</w:t>
       </w:r>
     </w:p>
     <w:p>
@@ -1888,17 +2046,75 @@
     <w:p>
       <w:pPr>
         <w:widowControl/>
-        <w:numPr>
-          <w:ilvl w:val="1"/>
-          <w:numId w:val="1"/>
-        </w:numPr>
         <w:autoSpaceDE/>
         <w:autoSpaceDN/>
         <w:spacing w:before="100" w:beforeAutospacing="1" w:after="100" w:afterAutospacing="1"/>
-      </w:pPr>
-      <w:r>
-        <w:t>Descarga la versión compatible con tu sistema operativo.</w:t>
-      </w:r>
+        <w:ind w:left="1440"/>
+      </w:pPr>
+      <w:r>
+        <w:rPr>
+          <w:noProof/>
+        </w:rPr>
+        <w:drawing>
+          <wp:inline distT="0" distB="0" distL="0" distR="0" wp14:anchorId="5A436D06" wp14:editId="424ECD27">
+            <wp:extent cx="4981575" cy="4981575"/>
+            <wp:effectExtent l="0" t="0" r="9525" b="9525"/>
+            <wp:docPr id="6" name="Imagen 6"/>
+            <wp:cNvGraphicFramePr>
+              <a:graphicFrameLocks xmlns:a="http://schemas.openxmlformats.org/drawingml/2006/main" noChangeAspect="1"/>
+            </wp:cNvGraphicFramePr>
+            <a:graphic xmlns:a="http://schemas.openxmlformats.org/drawingml/2006/main">
+              <a:graphicData uri="http://schemas.openxmlformats.org/drawingml/2006/picture">
+                <pic:pic xmlns:pic="http://schemas.openxmlformats.org/drawingml/2006/picture">
+                  <pic:nvPicPr>
+                    <pic:cNvPr id="6" name="Imagen 6"/>
+                    <pic:cNvPicPr/>
+                  </pic:nvPicPr>
+                  <pic:blipFill>
+                    <a:blip r:embed="rId8">
+                      <a:extLst>
+                        <a:ext uri="{28A0092B-C50C-407E-A947-70E740481C1C}">
+                          <a14:useLocalDpi xmlns:a14="http://schemas.microsoft.com/office/drawing/2010/main" val="0"/>
+                        </a:ext>
+                      </a:extLst>
+                    </a:blip>
+                    <a:stretch>
+                      <a:fillRect/>
+                    </a:stretch>
+                  </pic:blipFill>
+                  <pic:spPr>
+                    <a:xfrm>
+                      <a:off x="0" y="0"/>
+                      <a:ext cx="4981575" cy="4981575"/>
+                    </a:xfrm>
+                    <a:prstGeom prst="rect">
+                      <a:avLst/>
+                    </a:prstGeom>
+                  </pic:spPr>
+                </pic:pic>
+              </a:graphicData>
+            </a:graphic>
+          </wp:inline>
+        </w:drawing>
+      </w:r>
+    </w:p>
+    <w:p>
+      <w:pPr>
+        <w:widowControl/>
+        <w:autoSpaceDE/>
+        <w:autoSpaceDN/>
+        <w:spacing w:before="100" w:beforeAutospacing="1" w:after="100" w:afterAutospacing="1"/>
+        <w:ind w:left="1440"/>
+      </w:pPr>
+    </w:p>
+    <w:p>
+      <w:pPr>
+        <w:widowControl/>
+        <w:autoSpaceDE/>
+        <w:autoSpaceDN/>
+        <w:spacing w:before="100" w:beforeAutospacing="1" w:after="100" w:afterAutospacing="1"/>
+        <w:ind w:left="1440"/>
+      </w:pPr>
     </w:p>
     <w:p>
       <w:pPr>
@@ -1912,8 +2128,696 @@
         <w:spacing w:before="100" w:beforeAutospacing="1" w:after="100" w:afterAutospacing="1"/>
       </w:pPr>
       <w:r>
+        <w:lastRenderedPageBreak/>
+        <w:t>Descarga la versión compatible con tu sistema operativo.</w:t>
+      </w:r>
+    </w:p>
+    <w:p>
+      <w:pPr>
+        <w:widowControl/>
+        <w:autoSpaceDE/>
+        <w:autoSpaceDN/>
+        <w:spacing w:before="100" w:beforeAutospacing="1" w:after="100" w:afterAutospacing="1"/>
+        <w:ind w:left="1440"/>
+      </w:pPr>
+      <w:r>
+        <w:rPr>
+          <w:noProof/>
+        </w:rPr>
+        <w:drawing>
+          <wp:inline distT="0" distB="0" distL="0" distR="0" wp14:anchorId="04B06316" wp14:editId="23D79B0C">
+            <wp:extent cx="3968750" cy="3535461"/>
+            <wp:effectExtent l="0" t="0" r="0" b="8255"/>
+            <wp:docPr id="9" name="Imagen 9"/>
+            <wp:cNvGraphicFramePr>
+              <a:graphicFrameLocks xmlns:a="http://schemas.openxmlformats.org/drawingml/2006/main" noChangeAspect="1"/>
+            </wp:cNvGraphicFramePr>
+            <a:graphic xmlns:a="http://schemas.openxmlformats.org/drawingml/2006/main">
+              <a:graphicData uri="http://schemas.openxmlformats.org/drawingml/2006/picture">
+                <pic:pic xmlns:pic="http://schemas.openxmlformats.org/drawingml/2006/picture">
+                  <pic:nvPicPr>
+                    <pic:cNvPr id="9" name="Imagen 9"/>
+                    <pic:cNvPicPr/>
+                  </pic:nvPicPr>
+                  <pic:blipFill>
+                    <a:blip r:embed="rId9">
+                      <a:extLst>
+                        <a:ext uri="{28A0092B-C50C-407E-A947-70E740481C1C}">
+                          <a14:useLocalDpi xmlns:a14="http://schemas.microsoft.com/office/drawing/2010/main" val="0"/>
+                        </a:ext>
+                      </a:extLst>
+                    </a:blip>
+                    <a:stretch>
+                      <a:fillRect/>
+                    </a:stretch>
+                  </pic:blipFill>
+                  <pic:spPr>
+                    <a:xfrm>
+                      <a:off x="0" y="0"/>
+                      <a:ext cx="3986212" cy="3551017"/>
+                    </a:xfrm>
+                    <a:prstGeom prst="rect">
+                      <a:avLst/>
+                    </a:prstGeom>
+                  </pic:spPr>
+                </pic:pic>
+              </a:graphicData>
+            </a:graphic>
+          </wp:inline>
+        </w:drawing>
+      </w:r>
+    </w:p>
+    <w:p>
+      <w:pPr>
+        <w:widowControl/>
+        <w:autoSpaceDE/>
+        <w:autoSpaceDN/>
+        <w:spacing w:before="100" w:beforeAutospacing="1" w:after="100" w:afterAutospacing="1"/>
+        <w:ind w:left="1440"/>
+      </w:pPr>
+      <w:r>
+        <w:rPr>
+          <w:noProof/>
+        </w:rPr>
+        <w:drawing>
+          <wp:inline distT="0" distB="0" distL="0" distR="0" wp14:anchorId="5F403766" wp14:editId="1B7C836D">
+            <wp:extent cx="3835400" cy="3487446"/>
+            <wp:effectExtent l="0" t="0" r="0" b="0"/>
+            <wp:docPr id="4" name="Imagen 4"/>
+            <wp:cNvGraphicFramePr>
+              <a:graphicFrameLocks xmlns:a="http://schemas.openxmlformats.org/drawingml/2006/main" noChangeAspect="1"/>
+            </wp:cNvGraphicFramePr>
+            <a:graphic xmlns:a="http://schemas.openxmlformats.org/drawingml/2006/main">
+              <a:graphicData uri="http://schemas.openxmlformats.org/drawingml/2006/picture">
+                <pic:pic xmlns:pic="http://schemas.openxmlformats.org/drawingml/2006/picture">
+                  <pic:nvPicPr>
+                    <pic:cNvPr id="4" name="Imagen 4"/>
+                    <pic:cNvPicPr/>
+                  </pic:nvPicPr>
+                  <pic:blipFill>
+                    <a:blip r:embed="rId10">
+                      <a:extLst>
+                        <a:ext uri="{28A0092B-C50C-407E-A947-70E740481C1C}">
+                          <a14:useLocalDpi xmlns:a14="http://schemas.microsoft.com/office/drawing/2010/main" val="0"/>
+                        </a:ext>
+                      </a:extLst>
+                    </a:blip>
+                    <a:stretch>
+                      <a:fillRect/>
+                    </a:stretch>
+                  </pic:blipFill>
+                  <pic:spPr>
+                    <a:xfrm>
+                      <a:off x="0" y="0"/>
+                      <a:ext cx="3842530" cy="3493929"/>
+                    </a:xfrm>
+                    <a:prstGeom prst="rect">
+                      <a:avLst/>
+                    </a:prstGeom>
+                  </pic:spPr>
+                </pic:pic>
+              </a:graphicData>
+            </a:graphic>
+          </wp:inline>
+        </w:drawing>
+      </w:r>
+    </w:p>
+    <w:p>
+      <w:pPr>
+        <w:widowControl/>
+        <w:autoSpaceDE/>
+        <w:autoSpaceDN/>
+        <w:spacing w:before="100" w:beforeAutospacing="1" w:after="100" w:afterAutospacing="1"/>
+        <w:ind w:left="1440"/>
+      </w:pPr>
+    </w:p>
+    <w:p>
+      <w:pPr>
+        <w:widowControl/>
+        <w:autoSpaceDE/>
+        <w:autoSpaceDN/>
+        <w:spacing w:before="100" w:beforeAutospacing="1" w:after="100" w:afterAutospacing="1"/>
+        <w:ind w:left="1440"/>
+      </w:pPr>
+    </w:p>
+    <w:p>
+      <w:pPr>
+        <w:widowControl/>
+        <w:autoSpaceDE/>
+        <w:autoSpaceDN/>
+        <w:spacing w:before="100" w:beforeAutospacing="1" w:after="100" w:afterAutospacing="1"/>
+        <w:ind w:left="1440"/>
+      </w:pPr>
+      <w:r>
+        <w:rPr>
+          <w:noProof/>
+        </w:rPr>
+        <w:lastRenderedPageBreak/>
+        <w:drawing>
+          <wp:inline distT="0" distB="0" distL="0" distR="0" wp14:anchorId="2ED766AD" wp14:editId="3E2E31A9">
+            <wp:extent cx="3545505" cy="3591560"/>
+            <wp:effectExtent l="0" t="0" r="0" b="8890"/>
+            <wp:docPr id="5" name="Imagen 5"/>
+            <wp:cNvGraphicFramePr>
+              <a:graphicFrameLocks xmlns:a="http://schemas.openxmlformats.org/drawingml/2006/main" noChangeAspect="1"/>
+            </wp:cNvGraphicFramePr>
+            <a:graphic xmlns:a="http://schemas.openxmlformats.org/drawingml/2006/main">
+              <a:graphicData uri="http://schemas.openxmlformats.org/drawingml/2006/picture">
+                <pic:pic xmlns:pic="http://schemas.openxmlformats.org/drawingml/2006/picture">
+                  <pic:nvPicPr>
+                    <pic:cNvPr id="5" name="Imagen 5"/>
+                    <pic:cNvPicPr/>
+                  </pic:nvPicPr>
+                  <pic:blipFill>
+                    <a:blip r:embed="rId11">
+                      <a:extLst>
+                        <a:ext uri="{28A0092B-C50C-407E-A947-70E740481C1C}">
+                          <a14:useLocalDpi xmlns:a14="http://schemas.microsoft.com/office/drawing/2010/main" val="0"/>
+                        </a:ext>
+                      </a:extLst>
+                    </a:blip>
+                    <a:stretch>
+                      <a:fillRect/>
+                    </a:stretch>
+                  </pic:blipFill>
+                  <pic:spPr>
+                    <a:xfrm>
+                      <a:off x="0" y="0"/>
+                      <a:ext cx="3556440" cy="3602637"/>
+                    </a:xfrm>
+                    <a:prstGeom prst="rect">
+                      <a:avLst/>
+                    </a:prstGeom>
+                  </pic:spPr>
+                </pic:pic>
+              </a:graphicData>
+            </a:graphic>
+          </wp:inline>
+        </w:drawing>
+      </w:r>
+    </w:p>
+    <w:p>
+      <w:pPr>
+        <w:widowControl/>
+        <w:numPr>
+          <w:ilvl w:val="1"/>
+          <w:numId w:val="1"/>
+        </w:numPr>
+        <w:autoSpaceDE/>
+        <w:autoSpaceDN/>
+        <w:spacing w:before="100" w:beforeAutospacing="1" w:after="100" w:afterAutospacing="1"/>
+      </w:pPr>
+      <w:r>
         <w:t>Sigue las instrucciones del instalador para completar la instalación.</w:t>
       </w:r>
+    </w:p>
+    <w:p>
+      <w:pPr>
+        <w:widowControl/>
+        <w:autoSpaceDE/>
+        <w:autoSpaceDN/>
+        <w:spacing w:before="100" w:beforeAutospacing="1" w:after="100" w:afterAutospacing="1"/>
+        <w:ind w:left="1440"/>
+      </w:pPr>
+      <w:r>
+        <w:rPr>
+          <w:noProof/>
+        </w:rPr>
+        <w:drawing>
+          <wp:inline distT="0" distB="0" distL="0" distR="0" wp14:anchorId="6EA38339" wp14:editId="3E83CEC2">
+            <wp:extent cx="4448911" cy="3276600"/>
+            <wp:effectExtent l="0" t="0" r="8890" b="0"/>
+            <wp:docPr id="10" name="Imagen 10"/>
+            <wp:cNvGraphicFramePr>
+              <a:graphicFrameLocks xmlns:a="http://schemas.openxmlformats.org/drawingml/2006/main" noChangeAspect="1"/>
+            </wp:cNvGraphicFramePr>
+            <a:graphic xmlns:a="http://schemas.openxmlformats.org/drawingml/2006/main">
+              <a:graphicData uri="http://schemas.openxmlformats.org/drawingml/2006/picture">
+                <pic:pic xmlns:pic="http://schemas.openxmlformats.org/drawingml/2006/picture">
+                  <pic:nvPicPr>
+                    <pic:cNvPr id="10" name="Imagen 10"/>
+                    <pic:cNvPicPr/>
+                  </pic:nvPicPr>
+                  <pic:blipFill>
+                    <a:blip r:embed="rId12">
+                      <a:extLst>
+                        <a:ext uri="{28A0092B-C50C-407E-A947-70E740481C1C}">
+                          <a14:useLocalDpi xmlns:a14="http://schemas.microsoft.com/office/drawing/2010/main" val="0"/>
+                        </a:ext>
+                      </a:extLst>
+                    </a:blip>
+                    <a:stretch>
+                      <a:fillRect/>
+                    </a:stretch>
+                  </pic:blipFill>
+                  <pic:spPr>
+                    <a:xfrm>
+                      <a:off x="0" y="0"/>
+                      <a:ext cx="4465919" cy="3289127"/>
+                    </a:xfrm>
+                    <a:prstGeom prst="rect">
+                      <a:avLst/>
+                    </a:prstGeom>
+                  </pic:spPr>
+                </pic:pic>
+              </a:graphicData>
+            </a:graphic>
+          </wp:inline>
+        </w:drawing>
+      </w:r>
+    </w:p>
+    <w:p>
+      <w:pPr>
+        <w:widowControl/>
+        <w:autoSpaceDE/>
+        <w:autoSpaceDN/>
+        <w:spacing w:before="100" w:beforeAutospacing="1" w:after="100" w:afterAutospacing="1"/>
+        <w:ind w:left="1440"/>
+      </w:pPr>
+    </w:p>
+    <w:p>
+      <w:pPr>
+        <w:widowControl/>
+        <w:autoSpaceDE/>
+        <w:autoSpaceDN/>
+        <w:spacing w:before="100" w:beforeAutospacing="1" w:after="100" w:afterAutospacing="1"/>
+        <w:ind w:left="1440"/>
+      </w:pPr>
+    </w:p>
+    <w:p>
+      <w:pPr>
+        <w:widowControl/>
+        <w:autoSpaceDE/>
+        <w:autoSpaceDN/>
+        <w:spacing w:before="100" w:beforeAutospacing="1" w:after="100" w:afterAutospacing="1"/>
+        <w:ind w:left="1440"/>
+      </w:pPr>
+      <w:r>
+        <w:rPr>
+          <w:noProof/>
+        </w:rPr>
+        <w:lastRenderedPageBreak/>
+        <w:drawing>
+          <wp:inline distT="0" distB="0" distL="0" distR="0" wp14:anchorId="22297EF4" wp14:editId="27F2FDA1">
+            <wp:extent cx="4744112" cy="3686689"/>
+            <wp:effectExtent l="0" t="0" r="0" b="9525"/>
+            <wp:docPr id="11" name="Imagen 11"/>
+            <wp:cNvGraphicFramePr>
+              <a:graphicFrameLocks xmlns:a="http://schemas.openxmlformats.org/drawingml/2006/main" noChangeAspect="1"/>
+            </wp:cNvGraphicFramePr>
+            <a:graphic xmlns:a="http://schemas.openxmlformats.org/drawingml/2006/main">
+              <a:graphicData uri="http://schemas.openxmlformats.org/drawingml/2006/picture">
+                <pic:pic xmlns:pic="http://schemas.openxmlformats.org/drawingml/2006/picture">
+                  <pic:nvPicPr>
+                    <pic:cNvPr id="11" name="Imagen 11"/>
+                    <pic:cNvPicPr/>
+                  </pic:nvPicPr>
+                  <pic:blipFill>
+                    <a:blip r:embed="rId13">
+                      <a:extLst>
+                        <a:ext uri="{28A0092B-C50C-407E-A947-70E740481C1C}">
+                          <a14:useLocalDpi xmlns:a14="http://schemas.microsoft.com/office/drawing/2010/main" val="0"/>
+                        </a:ext>
+                      </a:extLst>
+                    </a:blip>
+                    <a:stretch>
+                      <a:fillRect/>
+                    </a:stretch>
+                  </pic:blipFill>
+                  <pic:spPr>
+                    <a:xfrm>
+                      <a:off x="0" y="0"/>
+                      <a:ext cx="4744112" cy="3686689"/>
+                    </a:xfrm>
+                    <a:prstGeom prst="rect">
+                      <a:avLst/>
+                    </a:prstGeom>
+                  </pic:spPr>
+                </pic:pic>
+              </a:graphicData>
+            </a:graphic>
+          </wp:inline>
+        </w:drawing>
+      </w:r>
+      <w:r>
+        <w:rPr>
+          <w:noProof/>
+        </w:rPr>
+        <w:drawing>
+          <wp:inline distT="0" distB="0" distL="0" distR="0" wp14:anchorId="5E94D9F5" wp14:editId="2FF8C163">
+            <wp:extent cx="4734586" cy="3667637"/>
+            <wp:effectExtent l="0" t="0" r="8890" b="9525"/>
+            <wp:docPr id="12" name="Imagen 12"/>
+            <wp:cNvGraphicFramePr>
+              <a:graphicFrameLocks xmlns:a="http://schemas.openxmlformats.org/drawingml/2006/main" noChangeAspect="1"/>
+            </wp:cNvGraphicFramePr>
+            <a:graphic xmlns:a="http://schemas.openxmlformats.org/drawingml/2006/main">
+              <a:graphicData uri="http://schemas.openxmlformats.org/drawingml/2006/picture">
+                <pic:pic xmlns:pic="http://schemas.openxmlformats.org/drawingml/2006/picture">
+                  <pic:nvPicPr>
+                    <pic:cNvPr id="12" name="Imagen 12"/>
+                    <pic:cNvPicPr/>
+                  </pic:nvPicPr>
+                  <pic:blipFill>
+                    <a:blip r:embed="rId14">
+                      <a:extLst>
+                        <a:ext uri="{28A0092B-C50C-407E-A947-70E740481C1C}">
+                          <a14:useLocalDpi xmlns:a14="http://schemas.microsoft.com/office/drawing/2010/main" val="0"/>
+                        </a:ext>
+                      </a:extLst>
+                    </a:blip>
+                    <a:stretch>
+                      <a:fillRect/>
+                    </a:stretch>
+                  </pic:blipFill>
+                  <pic:spPr>
+                    <a:xfrm>
+                      <a:off x="0" y="0"/>
+                      <a:ext cx="4734586" cy="3667637"/>
+                    </a:xfrm>
+                    <a:prstGeom prst="rect">
+                      <a:avLst/>
+                    </a:prstGeom>
+                  </pic:spPr>
+                </pic:pic>
+              </a:graphicData>
+            </a:graphic>
+          </wp:inline>
+        </w:drawing>
+      </w:r>
+      <w:r>
+        <w:rPr>
+          <w:noProof/>
+        </w:rPr>
+        <w:lastRenderedPageBreak/>
+        <w:drawing>
+          <wp:inline distT="0" distB="0" distL="0" distR="0" wp14:anchorId="2F37B217" wp14:editId="751FB9C5">
+            <wp:extent cx="4753638" cy="3686689"/>
+            <wp:effectExtent l="0" t="0" r="8890" b="9525"/>
+            <wp:docPr id="13" name="Imagen 13"/>
+            <wp:cNvGraphicFramePr>
+              <a:graphicFrameLocks xmlns:a="http://schemas.openxmlformats.org/drawingml/2006/main" noChangeAspect="1"/>
+            </wp:cNvGraphicFramePr>
+            <a:graphic xmlns:a="http://schemas.openxmlformats.org/drawingml/2006/main">
+              <a:graphicData uri="http://schemas.openxmlformats.org/drawingml/2006/picture">
+                <pic:pic xmlns:pic="http://schemas.openxmlformats.org/drawingml/2006/picture">
+                  <pic:nvPicPr>
+                    <pic:cNvPr id="13" name="Imagen 13"/>
+                    <pic:cNvPicPr/>
+                  </pic:nvPicPr>
+                  <pic:blipFill>
+                    <a:blip r:embed="rId15">
+                      <a:extLst>
+                        <a:ext uri="{28A0092B-C50C-407E-A947-70E740481C1C}">
+                          <a14:useLocalDpi xmlns:a14="http://schemas.microsoft.com/office/drawing/2010/main" val="0"/>
+                        </a:ext>
+                      </a:extLst>
+                    </a:blip>
+                    <a:stretch>
+                      <a:fillRect/>
+                    </a:stretch>
+                  </pic:blipFill>
+                  <pic:spPr>
+                    <a:xfrm>
+                      <a:off x="0" y="0"/>
+                      <a:ext cx="4753638" cy="3686689"/>
+                    </a:xfrm>
+                    <a:prstGeom prst="rect">
+                      <a:avLst/>
+                    </a:prstGeom>
+                  </pic:spPr>
+                </pic:pic>
+              </a:graphicData>
+            </a:graphic>
+          </wp:inline>
+        </w:drawing>
+      </w:r>
+      <w:r>
+        <w:rPr>
+          <w:noProof/>
+        </w:rPr>
+        <w:drawing>
+          <wp:inline distT="0" distB="0" distL="0" distR="0" wp14:anchorId="4FEBE01F" wp14:editId="5D26AD5B">
+            <wp:extent cx="4725059" cy="3686689"/>
+            <wp:effectExtent l="0" t="0" r="0" b="9525"/>
+            <wp:docPr id="14" name="Imagen 14"/>
+            <wp:cNvGraphicFramePr>
+              <a:graphicFrameLocks xmlns:a="http://schemas.openxmlformats.org/drawingml/2006/main" noChangeAspect="1"/>
+            </wp:cNvGraphicFramePr>
+            <a:graphic xmlns:a="http://schemas.openxmlformats.org/drawingml/2006/main">
+              <a:graphicData uri="http://schemas.openxmlformats.org/drawingml/2006/picture">
+                <pic:pic xmlns:pic="http://schemas.openxmlformats.org/drawingml/2006/picture">
+                  <pic:nvPicPr>
+                    <pic:cNvPr id="14" name="Imagen 14"/>
+                    <pic:cNvPicPr/>
+                  </pic:nvPicPr>
+                  <pic:blipFill>
+                    <a:blip r:embed="rId16">
+                      <a:extLst>
+                        <a:ext uri="{28A0092B-C50C-407E-A947-70E740481C1C}">
+                          <a14:useLocalDpi xmlns:a14="http://schemas.microsoft.com/office/drawing/2010/main" val="0"/>
+                        </a:ext>
+                      </a:extLst>
+                    </a:blip>
+                    <a:stretch>
+                      <a:fillRect/>
+                    </a:stretch>
+                  </pic:blipFill>
+                  <pic:spPr>
+                    <a:xfrm>
+                      <a:off x="0" y="0"/>
+                      <a:ext cx="4725059" cy="3686689"/>
+                    </a:xfrm>
+                    <a:prstGeom prst="rect">
+                      <a:avLst/>
+                    </a:prstGeom>
+                  </pic:spPr>
+                </pic:pic>
+              </a:graphicData>
+            </a:graphic>
+          </wp:inline>
+        </w:drawing>
+      </w:r>
+    </w:p>
+    <w:p>
+      <w:pPr>
+        <w:widowControl/>
+        <w:autoSpaceDE/>
+        <w:autoSpaceDN/>
+        <w:spacing w:before="100" w:beforeAutospacing="1" w:after="100" w:afterAutospacing="1"/>
+        <w:ind w:left="1440"/>
+      </w:pPr>
+    </w:p>
+    <w:p>
+      <w:pPr>
+        <w:widowControl/>
+        <w:autoSpaceDE/>
+        <w:autoSpaceDN/>
+        <w:spacing w:before="100" w:beforeAutospacing="1" w:after="100" w:afterAutospacing="1"/>
+        <w:ind w:left="1440"/>
+      </w:pPr>
+    </w:p>
+    <w:p>
+      <w:pPr>
+        <w:widowControl/>
+        <w:autoSpaceDE/>
+        <w:autoSpaceDN/>
+        <w:spacing w:before="100" w:beforeAutospacing="1" w:after="100" w:afterAutospacing="1"/>
+        <w:ind w:left="1440"/>
+      </w:pPr>
+      <w:r>
+        <w:rPr>
+          <w:noProof/>
+        </w:rPr>
+        <w:lastRenderedPageBreak/>
+        <w:drawing>
+          <wp:inline distT="0" distB="0" distL="0" distR="0" wp14:anchorId="0D7385C6" wp14:editId="565464E7">
+            <wp:extent cx="4725059" cy="3658111"/>
+            <wp:effectExtent l="0" t="0" r="0" b="0"/>
+            <wp:docPr id="15" name="Imagen 15"/>
+            <wp:cNvGraphicFramePr>
+              <a:graphicFrameLocks xmlns:a="http://schemas.openxmlformats.org/drawingml/2006/main" noChangeAspect="1"/>
+            </wp:cNvGraphicFramePr>
+            <a:graphic xmlns:a="http://schemas.openxmlformats.org/drawingml/2006/main">
+              <a:graphicData uri="http://schemas.openxmlformats.org/drawingml/2006/picture">
+                <pic:pic xmlns:pic="http://schemas.openxmlformats.org/drawingml/2006/picture">
+                  <pic:nvPicPr>
+                    <pic:cNvPr id="15" name="Imagen 15"/>
+                    <pic:cNvPicPr/>
+                  </pic:nvPicPr>
+                  <pic:blipFill>
+                    <a:blip r:embed="rId17">
+                      <a:extLst>
+                        <a:ext uri="{28A0092B-C50C-407E-A947-70E740481C1C}">
+                          <a14:useLocalDpi xmlns:a14="http://schemas.microsoft.com/office/drawing/2010/main" val="0"/>
+                        </a:ext>
+                      </a:extLst>
+                    </a:blip>
+                    <a:stretch>
+                      <a:fillRect/>
+                    </a:stretch>
+                  </pic:blipFill>
+                  <pic:spPr>
+                    <a:xfrm>
+                      <a:off x="0" y="0"/>
+                      <a:ext cx="4725059" cy="3658111"/>
+                    </a:xfrm>
+                    <a:prstGeom prst="rect">
+                      <a:avLst/>
+                    </a:prstGeom>
+                  </pic:spPr>
+                </pic:pic>
+              </a:graphicData>
+            </a:graphic>
+          </wp:inline>
+        </w:drawing>
+      </w:r>
+    </w:p>
+    <w:p>
+      <w:pPr>
+        <w:widowControl/>
+        <w:autoSpaceDE/>
+        <w:autoSpaceDN/>
+        <w:spacing w:before="100" w:beforeAutospacing="1" w:after="100" w:afterAutospacing="1"/>
+        <w:ind w:left="1440"/>
+      </w:pPr>
+      <w:r>
+        <w:t>Y ya estaría instalado</w:t>
+      </w:r>
+    </w:p>
+    <w:p>
+      <w:pPr>
+        <w:widowControl/>
+        <w:autoSpaceDE/>
+        <w:autoSpaceDN/>
+        <w:spacing w:before="100" w:beforeAutospacing="1" w:after="100" w:afterAutospacing="1"/>
+        <w:ind w:left="1440"/>
+      </w:pPr>
+    </w:p>
+    <w:p>
+      <w:pPr>
+        <w:pStyle w:val="Ttulo2"/>
+      </w:pPr>
+      <w:r>
+        <w:lastRenderedPageBreak/>
+        <w:t>Configuración a español</w:t>
+      </w:r>
+    </w:p>
+    <w:p>
+      <w:pPr>
+        <w:widowControl/>
+        <w:autoSpaceDE/>
+        <w:autoSpaceDN/>
+        <w:spacing w:before="100" w:beforeAutospacing="1" w:after="100" w:afterAutospacing="1"/>
+      </w:pPr>
+      <w:r>
+        <w:rPr>
+          <w:noProof/>
+        </w:rPr>
+        <w:drawing>
+          <wp:inline distT="0" distB="0" distL="0" distR="0" wp14:anchorId="5A8FBE8A" wp14:editId="6DF96AB4">
+            <wp:extent cx="2133898" cy="3562847"/>
+            <wp:effectExtent l="0" t="0" r="0" b="0"/>
+            <wp:docPr id="21" name="Imagen 21"/>
+            <wp:cNvGraphicFramePr>
+              <a:graphicFrameLocks xmlns:a="http://schemas.openxmlformats.org/drawingml/2006/main" noChangeAspect="1"/>
+            </wp:cNvGraphicFramePr>
+            <a:graphic xmlns:a="http://schemas.openxmlformats.org/drawingml/2006/main">
+              <a:graphicData uri="http://schemas.openxmlformats.org/drawingml/2006/picture">
+                <pic:pic xmlns:pic="http://schemas.openxmlformats.org/drawingml/2006/picture">
+                  <pic:nvPicPr>
+                    <pic:cNvPr id="21" name="Imagen 21"/>
+                    <pic:cNvPicPr/>
+                  </pic:nvPicPr>
+                  <pic:blipFill>
+                    <a:blip r:embed="rId18">
+                      <a:extLst>
+                        <a:ext uri="{28A0092B-C50C-407E-A947-70E740481C1C}">
+                          <a14:useLocalDpi xmlns:a14="http://schemas.microsoft.com/office/drawing/2010/main" val="0"/>
+                        </a:ext>
+                      </a:extLst>
+                    </a:blip>
+                    <a:stretch>
+                      <a:fillRect/>
+                    </a:stretch>
+                  </pic:blipFill>
+                  <pic:spPr>
+                    <a:xfrm>
+                      <a:off x="0" y="0"/>
+                      <a:ext cx="2133898" cy="3562847"/>
+                    </a:xfrm>
+                    <a:prstGeom prst="rect">
+                      <a:avLst/>
+                    </a:prstGeom>
+                  </pic:spPr>
+                </pic:pic>
+              </a:graphicData>
+            </a:graphic>
+          </wp:inline>
+        </w:drawing>
+      </w:r>
+    </w:p>
+    <w:p>
+      <w:pPr>
+        <w:widowControl/>
+        <w:autoSpaceDE/>
+        <w:autoSpaceDN/>
+        <w:spacing w:before="100" w:beforeAutospacing="1" w:after="100" w:afterAutospacing="1"/>
+      </w:pPr>
+      <w:r>
+        <w:rPr>
+          <w:noProof/>
+        </w:rPr>
+        <w:drawing>
+          <wp:inline distT="0" distB="0" distL="0" distR="0" wp14:anchorId="7B6147B8" wp14:editId="2ECAE2FE">
+            <wp:extent cx="5566477" cy="3838575"/>
+            <wp:effectExtent l="0" t="0" r="0" b="0"/>
+            <wp:docPr id="22" name="Imagen 22"/>
+            <wp:cNvGraphicFramePr>
+              <a:graphicFrameLocks xmlns:a="http://schemas.openxmlformats.org/drawingml/2006/main" noChangeAspect="1"/>
+            </wp:cNvGraphicFramePr>
+            <a:graphic xmlns:a="http://schemas.openxmlformats.org/drawingml/2006/main">
+              <a:graphicData uri="http://schemas.openxmlformats.org/drawingml/2006/picture">
+                <pic:pic xmlns:pic="http://schemas.openxmlformats.org/drawingml/2006/picture">
+                  <pic:nvPicPr>
+                    <pic:cNvPr id="22" name="Imagen 22"/>
+                    <pic:cNvPicPr/>
+                  </pic:nvPicPr>
+                  <pic:blipFill>
+                    <a:blip r:embed="rId19">
+                      <a:extLst>
+                        <a:ext uri="{28A0092B-C50C-407E-A947-70E740481C1C}">
+                          <a14:useLocalDpi xmlns:a14="http://schemas.microsoft.com/office/drawing/2010/main" val="0"/>
+                        </a:ext>
+                      </a:extLst>
+                    </a:blip>
+                    <a:stretch>
+                      <a:fillRect/>
+                    </a:stretch>
+                  </pic:blipFill>
+                  <pic:spPr>
+                    <a:xfrm>
+                      <a:off x="0" y="0"/>
+                      <a:ext cx="5589393" cy="3854378"/>
+                    </a:xfrm>
+                    <a:prstGeom prst="rect">
+                      <a:avLst/>
+                    </a:prstGeom>
+                  </pic:spPr>
+                </pic:pic>
+              </a:graphicData>
+            </a:graphic>
+          </wp:inline>
+        </w:drawing>
+      </w:r>
+    </w:p>
+    <w:p>
+      <w:pPr>
+        <w:widowControl/>
+        <w:autoSpaceDE/>
+        <w:autoSpaceDN/>
+        <w:spacing w:before="100" w:beforeAutospacing="1" w:after="100" w:afterAutospacing="1"/>
+      </w:pPr>
     </w:p>
     <w:p>
       <w:pPr>
@@ -1921,9 +2825,11 @@
         <w:ind w:firstLine="284"/>
       </w:pPr>
       <w:r>
+        <w:lastRenderedPageBreak/>
         <w:t>Instalación de Drivers y Reconocimiento del ESP32</w:t>
       </w:r>
     </w:p>
+    <w:p/>
     <w:p>
       <w:pPr>
         <w:pStyle w:val="NormalWeb"/>
@@ -1943,62 +2849,14 @@
         <w:autoSpaceDN/>
         <w:spacing w:before="100" w:beforeAutospacing="1" w:after="100" w:afterAutospacing="1"/>
       </w:pPr>
-      <w:hyperlink r:id="rId8" w:tgtFrame="_new" w:history="1">
+      <w:hyperlink r:id="rId20" w:tgtFrame="_new" w:history="1">
         <w:r>
           <w:rPr>
             <w:rStyle w:val="Hipervnculo"/>
             <w:b/>
             <w:bCs/>
           </w:rPr>
-          <w:t>Instalación de drive</w:t>
-        </w:r>
-        <w:r>
-          <w:rPr>
-            <w:rStyle w:val="Hipervnculo"/>
-            <w:b/>
-            <w:bCs/>
-          </w:rPr>
-          <w:t>r</w:t>
-        </w:r>
-        <w:r>
-          <w:rPr>
-            <w:rStyle w:val="Hipervnculo"/>
-            <w:b/>
-            <w:bCs/>
-          </w:rPr>
-          <w:t>s para</w:t>
-        </w:r>
-        <w:r>
-          <w:rPr>
-            <w:rStyle w:val="Hipervnculo"/>
-            <w:b/>
-            <w:bCs/>
-          </w:rPr>
-          <w:t xml:space="preserve"> </w:t>
-        </w:r>
-        <w:r>
-          <w:rPr>
-            <w:rStyle w:val="Hipervnculo"/>
-            <w:b/>
-            <w:bCs/>
-          </w:rPr>
-          <w:t>el</w:t>
-        </w:r>
-        <w:r>
-          <w:rPr>
-            <w:rStyle w:val="Hipervnculo"/>
-            <w:b/>
-            <w:bCs/>
-          </w:rPr>
-          <w:t xml:space="preserve"> </w:t>
-        </w:r>
-        <w:r>
-          <w:rPr>
-            <w:rStyle w:val="Hipervnculo"/>
-            <w:b/>
-            <w:bCs/>
-          </w:rPr>
-          <w:t>ESP32</w:t>
+          <w:t>Instalación de drivers para el ESP32</w:t>
         </w:r>
       </w:hyperlink>
     </w:p>
@@ -2013,7 +2871,7 @@
         <w:autoSpaceDN/>
         <w:spacing w:before="100" w:beforeAutospacing="1" w:after="100" w:afterAutospacing="1"/>
       </w:pPr>
-      <w:hyperlink r:id="rId9" w:tgtFrame="_new" w:history="1">
+      <w:hyperlink r:id="rId21" w:tgtFrame="_new" w:history="1">
         <w:r>
           <w:rPr>
             <w:rStyle w:val="Hipervnculo"/>
@@ -2073,12 +2931,14 @@
           <w:numId w:val="3"/>
         </w:numPr>
       </w:pPr>
+      <w:proofErr w:type="spellStart"/>
       <w:r>
         <w:rPr>
           <w:rStyle w:val="Textoennegrita"/>
         </w:rPr>
         <w:t>WiFi</w:t>
       </w:r>
+      <w:proofErr w:type="spellEnd"/>
       <w:r>
         <w:t>:</w:t>
       </w:r>
@@ -2103,6 +2963,7 @@
       <w:r>
         <w:t xml:space="preserve"> </w:t>
       </w:r>
+      <w:proofErr w:type="spellStart"/>
       <w:r>
         <w:rPr>
           <w:rStyle w:val="CdigoHTML"/>
@@ -2110,6 +2971,7 @@
         </w:rPr>
         <w:t>WiFi.h</w:t>
       </w:r>
+      <w:proofErr w:type="spellEnd"/>
     </w:p>
     <w:p>
       <w:pPr>
@@ -2129,7 +2991,15 @@
         <w:t>Descripción:</w:t>
       </w:r>
       <w:r>
-        <w:t xml:space="preserve"> Librería para la gestión de conexiones Wi-Fi.</w:t>
+        <w:t xml:space="preserve"> Librería para la gestión de conexiones </w:t>
+      </w:r>
+      <w:proofErr w:type="spellStart"/>
+      <w:r>
+        <w:t>Wi</w:t>
+      </w:r>
+      <w:proofErr w:type="spellEnd"/>
+      <w:r>
+        <w:t>-Fi.</w:t>
       </w:r>
     </w:p>
     <w:p>
@@ -2140,12 +3010,14 @@
           <w:numId w:val="3"/>
         </w:numPr>
       </w:pPr>
+      <w:proofErr w:type="spellStart"/>
       <w:r>
         <w:rPr>
           <w:rStyle w:val="Textoennegrita"/>
         </w:rPr>
         <w:t>WebServer</w:t>
       </w:r>
+      <w:proofErr w:type="spellEnd"/>
       <w:r>
         <w:t>:</w:t>
       </w:r>
@@ -2170,6 +3042,7 @@
       <w:r>
         <w:t xml:space="preserve"> </w:t>
       </w:r>
+      <w:proofErr w:type="spellStart"/>
       <w:r>
         <w:rPr>
           <w:rStyle w:val="CdigoHTML"/>
@@ -2177,6 +3050,7 @@
         </w:rPr>
         <w:t>WebServer.h</w:t>
       </w:r>
+      <w:proofErr w:type="spellEnd"/>
     </w:p>
     <w:p>
       <w:pPr>
@@ -2207,12 +3081,14 @@
           <w:numId w:val="3"/>
         </w:numPr>
       </w:pPr>
+      <w:proofErr w:type="spellStart"/>
       <w:r>
         <w:rPr>
           <w:rStyle w:val="Textoennegrita"/>
         </w:rPr>
         <w:t>HTTPClient</w:t>
       </w:r>
+      <w:proofErr w:type="spellEnd"/>
       <w:r>
         <w:t>:</w:t>
       </w:r>
@@ -2237,6 +3113,7 @@
       <w:r>
         <w:t xml:space="preserve"> </w:t>
       </w:r>
+      <w:proofErr w:type="spellStart"/>
       <w:r>
         <w:rPr>
           <w:rStyle w:val="CdigoHTML"/>
@@ -2244,6 +3121,7 @@
         </w:rPr>
         <w:t>HTTPClient.h</w:t>
       </w:r>
+      <w:proofErr w:type="spellEnd"/>
     </w:p>
     <w:p>
       <w:pPr>
@@ -2299,12 +3177,12 @@
         <w:rPr>
           <w:rStyle w:val="Textoennegrita"/>
         </w:rPr>
-        <w:lastRenderedPageBreak/>
         <w:t>Nombre del archivo:</w:t>
       </w:r>
       <w:r>
         <w:t xml:space="preserve"> </w:t>
       </w:r>
+      <w:proofErr w:type="spellStart"/>
       <w:r>
         <w:rPr>
           <w:rStyle w:val="CdigoHTML"/>
@@ -2312,6 +3190,7 @@
         </w:rPr>
         <w:t>time.h</w:t>
       </w:r>
+      <w:proofErr w:type="spellEnd"/>
     </w:p>
     <w:p>
       <w:pPr>
@@ -2336,769 +3215,79 @@
     </w:p>
     <w:p>
       <w:pPr>
-        <w:pStyle w:val="Ttulo4"/>
-      </w:pPr>
-      <w:r>
-        <w:t>Librerías que Deben ser Instaladas Manualmente</w:t>
-      </w:r>
-    </w:p>
-    <w:p>
-      <w:pPr>
-        <w:pStyle w:val="NormalWeb"/>
-      </w:pPr>
-      <w:r>
-        <w:t>Las siguientes librerías no vienen preinstaladas con el IDE de Arduino y deben ser instaladas manualmente. A continuación, se proporciona el nombre de la librería, el creador, y los pasos para su instalación:</w:t>
-      </w:r>
-    </w:p>
-    <w:p>
-      <w:pPr>
-        <w:pStyle w:val="NormalWeb"/>
-      </w:pPr>
-      <w:r>
-        <w:rPr>
-          <w:rStyle w:val="Textoennegrita"/>
-        </w:rPr>
-        <w:t>ArduinoJson</w:t>
-      </w:r>
-      <w:r>
-        <w:t>:</w:t>
-      </w:r>
-    </w:p>
-    <w:p>
-      <w:pPr>
         <w:widowControl/>
-        <w:numPr>
-          <w:ilvl w:val="0"/>
-          <w:numId w:val="4"/>
-        </w:numPr>
         <w:autoSpaceDE/>
         <w:autoSpaceDN/>
         <w:spacing w:before="100" w:beforeAutospacing="1" w:after="100" w:afterAutospacing="1"/>
-      </w:pPr>
-      <w:r>
-        <w:rPr>
-          <w:rStyle w:val="Textoennegrita"/>
-        </w:rPr>
-        <w:t>Nombre del archivo:</w:t>
-      </w:r>
-      <w:r>
-        <w:t xml:space="preserve"> </w:t>
-      </w:r>
-      <w:r>
-        <w:rPr>
-          <w:rStyle w:val="CdigoHTML"/>
-          <w:rFonts w:eastAsiaTheme="minorHAnsi"/>
-        </w:rPr>
-        <w:t>ArduinoJson.h</w:t>
-      </w:r>
+        <w:ind w:left="1440"/>
+      </w:pPr>
     </w:p>
     <w:p>
       <w:pPr>
         <w:widowControl/>
-        <w:numPr>
-          <w:ilvl w:val="0"/>
-          <w:numId w:val="4"/>
-        </w:numPr>
         <w:autoSpaceDE/>
         <w:autoSpaceDN/>
         <w:spacing w:before="100" w:beforeAutospacing="1" w:after="100" w:afterAutospacing="1"/>
-      </w:pPr>
-      <w:r>
-        <w:rPr>
-          <w:rStyle w:val="Textoennegrita"/>
-        </w:rPr>
-        <w:t>Creador:</w:t>
-      </w:r>
-      <w:r>
-        <w:t xml:space="preserve"> Benoit Blanchon</w:t>
-      </w:r>
+        <w:ind w:left="1440"/>
+      </w:pPr>
     </w:p>
     <w:p>
       <w:pPr>
         <w:widowControl/>
-        <w:numPr>
-          <w:ilvl w:val="0"/>
-          <w:numId w:val="4"/>
-        </w:numPr>
         <w:autoSpaceDE/>
         <w:autoSpaceDN/>
         <w:spacing w:before="100" w:beforeAutospacing="1" w:after="100" w:afterAutospacing="1"/>
-      </w:pPr>
-      <w:r>
-        <w:rPr>
-          <w:rStyle w:val="Textoennegrita"/>
-        </w:rPr>
-        <w:t>Descripción:</w:t>
-      </w:r>
-      <w:r>
-        <w:t xml:space="preserve"> Utilizada para manejar datos en formato JSON.</w:t>
-      </w:r>
+        <w:ind w:left="1440"/>
+      </w:pPr>
     </w:p>
     <w:p>
       <w:pPr>
         <w:widowControl/>
-        <w:numPr>
-          <w:ilvl w:val="0"/>
-          <w:numId w:val="4"/>
-        </w:numPr>
         <w:autoSpaceDE/>
         <w:autoSpaceDN/>
         <w:spacing w:before="100" w:beforeAutospacing="1" w:after="100" w:afterAutospacing="1"/>
-      </w:pPr>
-      <w:r>
-        <w:rPr>
-          <w:rStyle w:val="Textoennegrita"/>
-        </w:rPr>
-        <w:t>Instalación:</w:t>
-      </w:r>
+        <w:ind w:left="1440"/>
+      </w:pPr>
     </w:p>
     <w:p>
       <w:pPr>
         <w:widowControl/>
-        <w:numPr>
-          <w:ilvl w:val="1"/>
-          <w:numId w:val="4"/>
-        </w:numPr>
         <w:autoSpaceDE/>
         <w:autoSpaceDN/>
         <w:spacing w:before="100" w:beforeAutospacing="1" w:after="100" w:afterAutospacing="1"/>
-      </w:pPr>
-      <w:r>
-        <w:rPr>
-          <w:rStyle w:val="Textoennegrita"/>
-        </w:rPr>
-        <w:t>Desde el Arduino IDE</w:t>
-      </w:r>
-      <w:r>
-        <w:t>:</w:t>
+        <w:ind w:left="1440"/>
+      </w:pPr>
+    </w:p>
+    <w:p>
+      <w:pPr>
+        <w:pStyle w:val="Ttulo4"/>
+      </w:pPr>
+      <w:r>
+        <w:lastRenderedPageBreak/>
+        <w:t>Librerías que Deben ser Instaladas Manualmente</w:t>
+      </w:r>
+    </w:p>
+    <w:p>
+      <w:pPr>
+        <w:pStyle w:val="NormalWeb"/>
+      </w:pPr>
+      <w:r>
+        <w:t>Las siguientes librerías no vienen preinstaladas con el IDE de Arduino y deben ser instaladas manualmente. A continuación, se proporciona el nombre de la librería, el creador, y los pasos para su instalación:</w:t>
       </w:r>
     </w:p>
     <w:p>
       <w:pPr>
         <w:widowControl/>
-        <w:numPr>
-          <w:ilvl w:val="2"/>
-          <w:numId w:val="4"/>
-        </w:numPr>
         <w:autoSpaceDE/>
         <w:autoSpaceDN/>
         <w:spacing w:before="100" w:beforeAutospacing="1" w:after="100" w:afterAutospacing="1"/>
-      </w:pPr>
-      <w:r>
-        <w:t>Abre el Arduino IDE.</w:t>
-      </w:r>
-    </w:p>
-    <w:p>
-      <w:pPr>
-        <w:widowControl/>
-        <w:numPr>
-          <w:ilvl w:val="2"/>
-          <w:numId w:val="4"/>
-        </w:numPr>
-        <w:autoSpaceDE/>
-        <w:autoSpaceDN/>
-        <w:spacing w:before="100" w:beforeAutospacing="1" w:after="100" w:afterAutospacing="1"/>
-      </w:pPr>
-      <w:r>
-        <w:t xml:space="preserve">Ve a </w:t>
-      </w:r>
-      <w:r>
-        <w:rPr>
-          <w:rStyle w:val="Textoennegrita"/>
-        </w:rPr>
-        <w:t>Sketch</w:t>
-      </w:r>
-      <w:r>
-        <w:t xml:space="preserve"> &gt; </w:t>
-      </w:r>
-      <w:r>
-        <w:rPr>
-          <w:rStyle w:val="Textoennegrita"/>
-        </w:rPr>
-        <w:t>Include Library</w:t>
-      </w:r>
-      <w:r>
-        <w:t xml:space="preserve"> &gt; </w:t>
-      </w:r>
-      <w:r>
-        <w:rPr>
-          <w:rStyle w:val="Textoennegrita"/>
-        </w:rPr>
-        <w:t>Manage Libraries...</w:t>
-      </w:r>
-      <w:r>
-        <w:t>.</w:t>
-      </w:r>
-    </w:p>
-    <w:p>
-      <w:pPr>
-        <w:widowControl/>
-        <w:numPr>
-          <w:ilvl w:val="2"/>
-          <w:numId w:val="4"/>
-        </w:numPr>
-        <w:autoSpaceDE/>
-        <w:autoSpaceDN/>
-        <w:spacing w:before="100" w:beforeAutospacing="1" w:after="100" w:afterAutospacing="1"/>
-      </w:pPr>
-      <w:r>
-        <w:t xml:space="preserve">En la ventana del Administrador de Librerías, busca </w:t>
-      </w:r>
-      <w:r>
-        <w:rPr>
-          <w:rStyle w:val="CdigoHTML"/>
-          <w:rFonts w:eastAsiaTheme="minorHAnsi"/>
-        </w:rPr>
-        <w:t>ArduinoJson</w:t>
-      </w:r>
-      <w:r>
-        <w:t>.</w:t>
-      </w:r>
-    </w:p>
-    <w:p>
-      <w:pPr>
-        <w:widowControl/>
-        <w:numPr>
-          <w:ilvl w:val="2"/>
-          <w:numId w:val="4"/>
-        </w:numPr>
-        <w:autoSpaceDE/>
-        <w:autoSpaceDN/>
-        <w:spacing w:before="100" w:beforeAutospacing="1" w:after="100" w:afterAutospacing="1"/>
-      </w:pPr>
-      <w:r>
-        <w:t xml:space="preserve">Selecciona la versión más reciente y haz clic en </w:t>
-      </w:r>
-      <w:r>
-        <w:rPr>
-          <w:rStyle w:val="Textoennegrita"/>
-        </w:rPr>
-        <w:t>Install</w:t>
-      </w:r>
-      <w:r>
-        <w:t>.</w:t>
-      </w:r>
-    </w:p>
-    <w:p>
-      <w:pPr>
-        <w:widowControl/>
-        <w:numPr>
-          <w:ilvl w:val="1"/>
-          <w:numId w:val="4"/>
-        </w:numPr>
-        <w:autoSpaceDE/>
-        <w:autoSpaceDN/>
-        <w:spacing w:before="100" w:beforeAutospacing="1" w:after="100" w:afterAutospacing="1"/>
-      </w:pPr>
-      <w:r>
-        <w:rPr>
-          <w:rStyle w:val="Textoennegrita"/>
-        </w:rPr>
-        <w:t>Desde GitHub</w:t>
-      </w:r>
-      <w:r>
-        <w:t>:</w:t>
-      </w:r>
-    </w:p>
-    <w:p>
-      <w:pPr>
-        <w:widowControl/>
-        <w:numPr>
-          <w:ilvl w:val="2"/>
-          <w:numId w:val="4"/>
-        </w:numPr>
-        <w:autoSpaceDE/>
-        <w:autoSpaceDN/>
-        <w:spacing w:before="100" w:beforeAutospacing="1" w:after="100" w:afterAutospacing="1"/>
-      </w:pPr>
-      <w:r>
-        <w:t xml:space="preserve">Visita el </w:t>
-      </w:r>
-      <w:hyperlink r:id="rId10" w:tgtFrame="_new" w:history="1">
-        <w:r>
-          <w:rPr>
-            <w:rStyle w:val="Hipervnculo"/>
-          </w:rPr>
-          <w:t>repositorio oficial de ArduinoJson en GitHub</w:t>
-        </w:r>
-      </w:hyperlink>
-      <w:r>
-        <w:t>.</w:t>
-      </w:r>
-    </w:p>
-    <w:p>
-      <w:pPr>
-        <w:widowControl/>
-        <w:numPr>
-          <w:ilvl w:val="2"/>
-          <w:numId w:val="4"/>
-        </w:numPr>
-        <w:autoSpaceDE/>
-        <w:autoSpaceDN/>
-        <w:spacing w:before="100" w:beforeAutospacing="1" w:after="100" w:afterAutospacing="1"/>
-      </w:pPr>
-      <w:r>
-        <w:t>Descarga el archivo ZIP de la librería.</w:t>
-      </w:r>
-    </w:p>
-    <w:p>
-      <w:pPr>
-        <w:widowControl/>
-        <w:numPr>
-          <w:ilvl w:val="2"/>
-          <w:numId w:val="4"/>
-        </w:numPr>
-        <w:autoSpaceDE/>
-        <w:autoSpaceDN/>
-        <w:spacing w:before="100" w:beforeAutospacing="1" w:after="100" w:afterAutospacing="1"/>
-      </w:pPr>
-      <w:r>
-        <w:t xml:space="preserve">En el Arduino IDE, ve a </w:t>
-      </w:r>
-      <w:r>
-        <w:rPr>
-          <w:rStyle w:val="Textoennegrita"/>
-        </w:rPr>
-        <w:t>Sketch</w:t>
-      </w:r>
-      <w:r>
-        <w:t xml:space="preserve"> &gt; </w:t>
-      </w:r>
-      <w:r>
-        <w:rPr>
-          <w:rStyle w:val="Textoennegrita"/>
-        </w:rPr>
-        <w:t>Include Library</w:t>
-      </w:r>
-      <w:r>
-        <w:t xml:space="preserve"> &gt; </w:t>
-      </w:r>
-      <w:r>
-        <w:rPr>
-          <w:rStyle w:val="Textoennegrita"/>
-        </w:rPr>
-        <w:t>Add .ZIP Library...</w:t>
-      </w:r>
-      <w:r>
-        <w:t>.</w:t>
-      </w:r>
-    </w:p>
-    <w:p>
-      <w:pPr>
-        <w:widowControl/>
-        <w:numPr>
-          <w:ilvl w:val="2"/>
-          <w:numId w:val="4"/>
-        </w:numPr>
-        <w:autoSpaceDE/>
-        <w:autoSpaceDN/>
-        <w:spacing w:before="100" w:beforeAutospacing="1" w:after="100" w:afterAutospacing="1"/>
-      </w:pPr>
-      <w:r>
-        <w:t xml:space="preserve">Selecciona el archivo ZIP descargado y haz clic en </w:t>
-      </w:r>
-      <w:r>
-        <w:rPr>
-          <w:rStyle w:val="Textoennegrita"/>
-        </w:rPr>
-        <w:t>Open</w:t>
-      </w:r>
-      <w:r>
-        <w:t xml:space="preserve"> para instalarlo.</w:t>
-      </w:r>
-    </w:p>
-    <w:p>
-      <w:pPr>
-        <w:pStyle w:val="NormalWeb"/>
-      </w:pPr>
-      <w:r>
-        <w:rPr>
-          <w:rStyle w:val="Textoennegrita"/>
-        </w:rPr>
-        <w:t>Adafruit Unified Sensor</w:t>
-      </w:r>
-      <w:r>
-        <w:t>:</w:t>
-      </w:r>
-    </w:p>
-    <w:p>
-      <w:pPr>
-        <w:widowControl/>
-        <w:numPr>
-          <w:ilvl w:val="0"/>
-          <w:numId w:val="5"/>
-        </w:numPr>
-        <w:autoSpaceDE/>
-        <w:autoSpaceDN/>
-        <w:spacing w:before="100" w:beforeAutospacing="1" w:after="100" w:afterAutospacing="1"/>
-      </w:pPr>
-      <w:r>
-        <w:rPr>
-          <w:rStyle w:val="Textoennegrita"/>
-        </w:rPr>
-        <w:t>Nombre del archivo:</w:t>
-      </w:r>
-      <w:r>
-        <w:t xml:space="preserve"> </w:t>
-      </w:r>
-      <w:r>
-        <w:rPr>
-          <w:rStyle w:val="CdigoHTML"/>
-          <w:rFonts w:eastAsiaTheme="minorHAnsi"/>
-        </w:rPr>
-        <w:t>DHTesp.h</w:t>
-      </w:r>
-    </w:p>
-    <w:p>
-      <w:pPr>
-        <w:widowControl/>
-        <w:numPr>
-          <w:ilvl w:val="0"/>
-          <w:numId w:val="5"/>
-        </w:numPr>
-        <w:autoSpaceDE/>
-        <w:autoSpaceDN/>
-        <w:spacing w:before="100" w:beforeAutospacing="1" w:after="100" w:afterAutospacing="1"/>
-      </w:pPr>
-      <w:r>
-        <w:rPr>
-          <w:rStyle w:val="Textoennegrita"/>
-        </w:rPr>
-        <w:t>Creador:</w:t>
-      </w:r>
-      <w:r>
-        <w:t xml:space="preserve"> Adafruit</w:t>
-      </w:r>
-    </w:p>
-    <w:p>
-      <w:pPr>
-        <w:widowControl/>
-        <w:numPr>
-          <w:ilvl w:val="0"/>
-          <w:numId w:val="5"/>
-        </w:numPr>
-        <w:autoSpaceDE/>
-        <w:autoSpaceDN/>
-        <w:spacing w:before="100" w:beforeAutospacing="1" w:after="100" w:afterAutospacing="1"/>
-      </w:pPr>
-      <w:r>
-        <w:rPr>
-          <w:rStyle w:val="Textoennegrita"/>
-        </w:rPr>
-        <w:t>Descripción:</w:t>
-      </w:r>
-      <w:r>
-        <w:t xml:space="preserve"> Librería para manejar sensores DHT11.</w:t>
-      </w:r>
-    </w:p>
-    <w:p>
-      <w:pPr>
-        <w:widowControl/>
-        <w:numPr>
-          <w:ilvl w:val="0"/>
-          <w:numId w:val="5"/>
-        </w:numPr>
-        <w:autoSpaceDE/>
-        <w:autoSpaceDN/>
-        <w:spacing w:before="100" w:beforeAutospacing="1" w:after="100" w:afterAutospacing="1"/>
-      </w:pPr>
-      <w:r>
-        <w:rPr>
-          <w:rStyle w:val="Textoennegrita"/>
-        </w:rPr>
-        <w:t>Instalación:</w:t>
-      </w:r>
-    </w:p>
-    <w:p>
-      <w:pPr>
-        <w:widowControl/>
-        <w:numPr>
-          <w:ilvl w:val="1"/>
-          <w:numId w:val="5"/>
-        </w:numPr>
-        <w:autoSpaceDE/>
-        <w:autoSpaceDN/>
-        <w:spacing w:before="100" w:beforeAutospacing="1" w:after="100" w:afterAutospacing="1"/>
-      </w:pPr>
-      <w:r>
-        <w:rPr>
-          <w:rStyle w:val="Textoennegrita"/>
-        </w:rPr>
-        <w:t>Desde el Arduino IDE</w:t>
-      </w:r>
-      <w:r>
-        <w:t>:</w:t>
-      </w:r>
-    </w:p>
-    <w:p>
-      <w:pPr>
-        <w:widowControl/>
-        <w:numPr>
-          <w:ilvl w:val="2"/>
-          <w:numId w:val="5"/>
-        </w:numPr>
-        <w:autoSpaceDE/>
-        <w:autoSpaceDN/>
-        <w:spacing w:before="100" w:beforeAutospacing="1" w:after="100" w:afterAutospacing="1"/>
-      </w:pPr>
-      <w:r>
-        <w:t>Abre el Arduino IDE.</w:t>
-      </w:r>
-    </w:p>
-    <w:p>
-      <w:pPr>
-        <w:widowControl/>
-        <w:numPr>
-          <w:ilvl w:val="2"/>
-          <w:numId w:val="5"/>
-        </w:numPr>
-        <w:autoSpaceDE/>
-        <w:autoSpaceDN/>
-        <w:spacing w:before="100" w:beforeAutospacing="1" w:after="100" w:afterAutospacing="1"/>
-      </w:pPr>
-      <w:r>
-        <w:t xml:space="preserve">Ve a </w:t>
-      </w:r>
-      <w:r>
-        <w:rPr>
-          <w:rStyle w:val="Textoennegrita"/>
-        </w:rPr>
-        <w:t>Sketch</w:t>
-      </w:r>
-      <w:r>
-        <w:t xml:space="preserve"> &gt; </w:t>
-      </w:r>
-      <w:r>
-        <w:rPr>
-          <w:rStyle w:val="Textoennegrita"/>
-        </w:rPr>
-        <w:t>Include Library</w:t>
-      </w:r>
-      <w:r>
-        <w:t xml:space="preserve"> &gt; </w:t>
-      </w:r>
-      <w:r>
-        <w:rPr>
-          <w:rStyle w:val="Textoennegrita"/>
-        </w:rPr>
-        <w:t>Manage Libraries...</w:t>
-      </w:r>
-      <w:r>
-        <w:t>.</w:t>
-      </w:r>
-    </w:p>
-    <w:p>
-      <w:pPr>
-        <w:widowControl/>
-        <w:numPr>
-          <w:ilvl w:val="2"/>
-          <w:numId w:val="5"/>
-        </w:numPr>
-        <w:autoSpaceDE/>
-        <w:autoSpaceDN/>
-        <w:spacing w:before="100" w:beforeAutospacing="1" w:after="100" w:afterAutospacing="1"/>
-      </w:pPr>
-      <w:r>
-        <w:t xml:space="preserve">Busca </w:t>
-      </w:r>
-      <w:r>
-        <w:rPr>
-          <w:rStyle w:val="CdigoHTML"/>
-          <w:rFonts w:eastAsiaTheme="minorHAnsi"/>
-        </w:rPr>
-        <w:t>Adafruit Unified Sensor</w:t>
-      </w:r>
-      <w:r>
-        <w:t>.</w:t>
-      </w:r>
-    </w:p>
-    <w:p>
-      <w:pPr>
-        <w:widowControl/>
-        <w:numPr>
-          <w:ilvl w:val="2"/>
-          <w:numId w:val="5"/>
-        </w:numPr>
-        <w:autoSpaceDE/>
-        <w:autoSpaceDN/>
-        <w:spacing w:before="100" w:beforeAutospacing="1" w:after="100" w:afterAutospacing="1"/>
-      </w:pPr>
-      <w:r>
-        <w:t xml:space="preserve">Selecciona la versión más reciente y haz clic en </w:t>
-      </w:r>
-      <w:r>
-        <w:rPr>
-          <w:rStyle w:val="Textoennegrita"/>
-        </w:rPr>
-        <w:t>Install</w:t>
-      </w:r>
-      <w:r>
-        <w:t>.</w:t>
-      </w:r>
-    </w:p>
-    <w:p>
-      <w:pPr>
-        <w:widowControl/>
-        <w:numPr>
-          <w:ilvl w:val="1"/>
-          <w:numId w:val="5"/>
-        </w:numPr>
-        <w:autoSpaceDE/>
-        <w:autoSpaceDN/>
-        <w:spacing w:before="100" w:beforeAutospacing="1" w:after="100" w:afterAutospacing="1"/>
-      </w:pPr>
-      <w:r>
-        <w:rPr>
-          <w:rStyle w:val="Textoennegrita"/>
-        </w:rPr>
-        <w:t>Desde GitHub</w:t>
-      </w:r>
-      <w:r>
-        <w:t>:</w:t>
-      </w:r>
-    </w:p>
-    <w:p>
-      <w:pPr>
-        <w:widowControl/>
-        <w:numPr>
-          <w:ilvl w:val="2"/>
-          <w:numId w:val="5"/>
-        </w:numPr>
-        <w:autoSpaceDE/>
-        <w:autoSpaceDN/>
-        <w:spacing w:before="100" w:beforeAutospacing="1" w:after="100" w:afterAutospacing="1"/>
-      </w:pPr>
-      <w:r>
-        <w:t xml:space="preserve">Visita el </w:t>
-      </w:r>
-      <w:hyperlink r:id="rId11" w:tgtFrame="_new" w:history="1">
-        <w:r>
-          <w:rPr>
-            <w:rStyle w:val="Hipervnculo"/>
-          </w:rPr>
-          <w:t>repositorio de Adafruit Unified Sensor en GitHub</w:t>
-        </w:r>
-      </w:hyperlink>
-      <w:r>
-        <w:t>.</w:t>
-      </w:r>
-    </w:p>
-    <w:p>
-      <w:pPr>
-        <w:widowControl/>
-        <w:numPr>
-          <w:ilvl w:val="2"/>
-          <w:numId w:val="5"/>
-        </w:numPr>
-        <w:autoSpaceDE/>
-        <w:autoSpaceDN/>
-        <w:spacing w:before="100" w:beforeAutospacing="1" w:after="100" w:afterAutospacing="1"/>
-      </w:pPr>
-      <w:r>
-        <w:t>Descarga el archivo ZIP de la librería.</w:t>
-      </w:r>
-    </w:p>
-    <w:p>
-      <w:pPr>
-        <w:widowControl/>
-        <w:numPr>
-          <w:ilvl w:val="2"/>
-          <w:numId w:val="5"/>
-        </w:numPr>
-        <w:autoSpaceDE/>
-        <w:autoSpaceDN/>
-        <w:spacing w:before="100" w:beforeAutospacing="1" w:after="100" w:afterAutospacing="1"/>
-      </w:pPr>
-      <w:r>
-        <w:t xml:space="preserve">En el Arduino IDE, ve a </w:t>
-      </w:r>
-      <w:r>
-        <w:rPr>
-          <w:rStyle w:val="Textoennegrita"/>
-        </w:rPr>
-        <w:t>Sketch</w:t>
-      </w:r>
-      <w:r>
-        <w:t xml:space="preserve"> &gt; </w:t>
-      </w:r>
-      <w:r>
-        <w:rPr>
-          <w:rStyle w:val="Textoennegrita"/>
-        </w:rPr>
-        <w:t>Include Library</w:t>
-      </w:r>
-      <w:r>
-        <w:t xml:space="preserve"> &gt; </w:t>
-      </w:r>
-      <w:r>
-        <w:rPr>
-          <w:rStyle w:val="Textoennegrita"/>
-        </w:rPr>
-        <w:t>Add .ZIP Library...</w:t>
-      </w:r>
-      <w:r>
-        <w:t>.</w:t>
-      </w:r>
-    </w:p>
-    <w:p>
-      <w:pPr>
-        <w:widowControl/>
-        <w:numPr>
-          <w:ilvl w:val="2"/>
-          <w:numId w:val="5"/>
-        </w:numPr>
-        <w:autoSpaceDE/>
-        <w:autoSpaceDN/>
-        <w:spacing w:before="100" w:beforeAutospacing="1" w:after="100" w:afterAutospacing="1"/>
-      </w:pPr>
-      <w:r>
-        <w:t xml:space="preserve">Selecciona el archivo ZIP descargado y haz clic en </w:t>
-      </w:r>
-      <w:r>
-        <w:rPr>
-          <w:rStyle w:val="Textoennegrita"/>
-        </w:rPr>
-        <w:t>Open</w:t>
-      </w:r>
-      <w:r>
-        <w:t xml:space="preserve"> para instalarlo.</w:t>
-      </w:r>
-    </w:p>
-    <w:p>
-      <w:pPr>
-        <w:widowControl/>
-        <w:numPr>
-          <w:ilvl w:val="1"/>
-          <w:numId w:val="5"/>
-        </w:numPr>
-        <w:autoSpaceDE/>
-        <w:autoSpaceDN/>
-        <w:spacing w:before="100" w:beforeAutospacing="1" w:after="100" w:afterAutospacing="1"/>
-      </w:pPr>
-      <w:r>
-        <w:t>O DTH sensor library for ESPx  de beegee_tokyo</w:t>
-      </w:r>
-      <w:r>
-        <w:t xml:space="preserve"> (recomendado)</w:t>
-      </w:r>
-    </w:p>
-    <w:p>
-      <w:pPr>
-        <w:widowControl/>
-        <w:numPr>
-          <w:ilvl w:val="1"/>
-          <w:numId w:val="5"/>
-        </w:numPr>
-        <w:autoSpaceDE/>
-        <w:autoSpaceDN/>
-        <w:spacing w:before="100" w:beforeAutospacing="1" w:after="100" w:afterAutospacing="1"/>
+        <w:ind w:left="1440"/>
       </w:pPr>
       <w:r>
         <w:rPr>
           <w:noProof/>
           <w:lang w:val="es-CO" w:eastAsia="es-CO"/>
         </w:rPr>
-        <w:lastRenderedPageBreak/>
         <w:drawing>
           <wp:inline distT="0" distB="0" distL="0" distR="0" wp14:anchorId="71B473B8" wp14:editId="0232FD8F">
             <wp:extent cx="3105583" cy="3886742"/>
@@ -3115,7 +3304,7 @@
                     <pic:cNvPicPr/>
                   </pic:nvPicPr>
                   <pic:blipFill>
-                    <a:blip r:embed="rId12">
+                    <a:blip r:embed="rId22">
                       <a:extLst>
                         <a:ext uri="{28A0092B-C50C-407E-A947-70E740481C1C}">
                           <a14:useLocalDpi xmlns:a14="http://schemas.microsoft.com/office/drawing/2010/main" val="0"/>
@@ -3144,49 +3333,11 @@
     </w:p>
     <w:p>
       <w:pPr>
-        <w:pStyle w:val="NormalWeb"/>
-      </w:pPr>
-      <w:r>
-        <w:rPr>
-          <w:rStyle w:val="Textoennegrita"/>
-        </w:rPr>
-        <w:t>Video de Referencia para Instalación de Librerías:</w:t>
-      </w:r>
-    </w:p>
-    <w:p>
-      <w:pPr>
-        <w:widowControl/>
-        <w:numPr>
-          <w:ilvl w:val="0"/>
-          <w:numId w:val="6"/>
-        </w:numPr>
-        <w:autoSpaceDE/>
-        <w:autoSpaceDN/>
-        <w:spacing w:before="100" w:beforeAutospacing="1" w:after="100" w:afterAutospacing="1"/>
-        <w:rPr>
-          <w:rStyle w:val="Hipervnculo"/>
-          <w:color w:val="auto"/>
-          <w:u w:val="none"/>
-        </w:rPr>
-      </w:pPr>
-      <w:hyperlink r:id="rId13" w:tgtFrame="_new" w:history="1">
-        <w:r>
-          <w:rPr>
-            <w:rStyle w:val="Hipervnculo"/>
-          </w:rPr>
-          <w:t>Cómo instalar librerías en el IDE de Arduino</w:t>
-        </w:r>
-      </w:hyperlink>
-    </w:p>
-    <w:p>
-      <w:pPr>
         <w:widowControl/>
         <w:autoSpaceDE/>
         <w:autoSpaceDN/>
         <w:spacing w:before="100" w:beforeAutospacing="1" w:after="100" w:afterAutospacing="1"/>
-        <w:rPr>
-          <w:rStyle w:val="Hipervnculo"/>
-        </w:rPr>
+        <w:ind w:left="1440"/>
       </w:pPr>
     </w:p>
     <w:p>
@@ -3195,9 +3346,7 @@
         <w:autoSpaceDE/>
         <w:autoSpaceDN/>
         <w:spacing w:before="100" w:beforeAutospacing="1" w:after="100" w:afterAutospacing="1"/>
-        <w:rPr>
-          <w:rStyle w:val="Hipervnculo"/>
-        </w:rPr>
+        <w:ind w:left="1440"/>
       </w:pPr>
     </w:p>
     <w:p>
@@ -3206,9 +3355,7 @@
         <w:autoSpaceDE/>
         <w:autoSpaceDN/>
         <w:spacing w:before="100" w:beforeAutospacing="1" w:after="100" w:afterAutospacing="1"/>
-        <w:rPr>
-          <w:rStyle w:val="Hipervnculo"/>
-        </w:rPr>
+        <w:ind w:left="1440"/>
       </w:pPr>
     </w:p>
     <w:p>
@@ -3217,9 +3364,7 @@
         <w:autoSpaceDE/>
         <w:autoSpaceDN/>
         <w:spacing w:before="100" w:beforeAutospacing="1" w:after="100" w:afterAutospacing="1"/>
-        <w:rPr>
-          <w:rStyle w:val="Hipervnculo"/>
-        </w:rPr>
+        <w:ind w:left="1440"/>
       </w:pPr>
     </w:p>
     <w:p>
@@ -3228,9 +3373,7 @@
         <w:autoSpaceDE/>
         <w:autoSpaceDN/>
         <w:spacing w:before="100" w:beforeAutospacing="1" w:after="100" w:afterAutospacing="1"/>
-        <w:rPr>
-          <w:rStyle w:val="Hipervnculo"/>
-        </w:rPr>
+        <w:ind w:left="1440"/>
       </w:pPr>
     </w:p>
     <w:p>
@@ -3239,9 +3382,7 @@
         <w:autoSpaceDE/>
         <w:autoSpaceDN/>
         <w:spacing w:before="100" w:beforeAutospacing="1" w:after="100" w:afterAutospacing="1"/>
-        <w:rPr>
-          <w:rStyle w:val="Hipervnculo"/>
-        </w:rPr>
+        <w:ind w:left="1440"/>
       </w:pPr>
     </w:p>
     <w:p>
@@ -3250,17 +3391,162 @@
         <w:autoSpaceDE/>
         <w:autoSpaceDN/>
         <w:spacing w:before="100" w:beforeAutospacing="1" w:after="100" w:afterAutospacing="1"/>
-      </w:pPr>
+        <w:ind w:left="1440"/>
+      </w:pPr>
+    </w:p>
+    <w:p>
+      <w:pPr>
+        <w:widowControl/>
+        <w:autoSpaceDE/>
+        <w:autoSpaceDN/>
+        <w:spacing w:before="100" w:beforeAutospacing="1" w:after="100" w:afterAutospacing="1"/>
+        <w:ind w:left="1440"/>
+      </w:pPr>
+    </w:p>
+    <w:p>
+      <w:pPr>
+        <w:widowControl/>
+        <w:autoSpaceDE/>
+        <w:autoSpaceDN/>
+        <w:spacing w:before="100" w:beforeAutospacing="1" w:after="100" w:afterAutospacing="1"/>
+        <w:ind w:left="1440"/>
+      </w:pPr>
+    </w:p>
+    <w:p>
+      <w:pPr>
+        <w:pStyle w:val="Ttulo3"/>
+      </w:pPr>
+      <w:r>
+        <w:lastRenderedPageBreak/>
+        <w:t>Pasos para instalar</w:t>
+      </w:r>
+      <w:r>
+        <w:t xml:space="preserve"> las librerías </w:t>
+      </w:r>
+    </w:p>
+    <w:p/>
+    <w:p>
+      <w:r>
+        <w:t>Das click al icono de libros, buscas la librería y le das instalar</w:t>
+      </w:r>
+    </w:p>
+    <w:p/>
+    <w:p>
+      <w:r>
+        <w:rPr>
+          <w:noProof/>
+        </w:rPr>
+        <w:drawing>
+          <wp:inline distT="0" distB="0" distL="0" distR="0" wp14:anchorId="630CA1E3" wp14:editId="5A30AC9F">
+            <wp:extent cx="2409825" cy="3500404"/>
+            <wp:effectExtent l="0" t="0" r="0" b="5080"/>
+            <wp:docPr id="29" name="Imagen 29"/>
+            <wp:cNvGraphicFramePr>
+              <a:graphicFrameLocks xmlns:a="http://schemas.openxmlformats.org/drawingml/2006/main" noChangeAspect="1"/>
+            </wp:cNvGraphicFramePr>
+            <a:graphic xmlns:a="http://schemas.openxmlformats.org/drawingml/2006/main">
+              <a:graphicData uri="http://schemas.openxmlformats.org/drawingml/2006/picture">
+                <pic:pic xmlns:pic="http://schemas.openxmlformats.org/drawingml/2006/picture">
+                  <pic:nvPicPr>
+                    <pic:cNvPr id="29" name="Imagen 29"/>
+                    <pic:cNvPicPr/>
+                  </pic:nvPicPr>
+                  <pic:blipFill>
+                    <a:blip r:embed="rId23">
+                      <a:extLst>
+                        <a:ext uri="{28A0092B-C50C-407E-A947-70E740481C1C}">
+                          <a14:useLocalDpi xmlns:a14="http://schemas.microsoft.com/office/drawing/2010/main" val="0"/>
+                        </a:ext>
+                      </a:extLst>
+                    </a:blip>
+                    <a:stretch>
+                      <a:fillRect/>
+                    </a:stretch>
+                  </pic:blipFill>
+                  <pic:spPr>
+                    <a:xfrm>
+                      <a:off x="0" y="0"/>
+                      <a:ext cx="2417141" cy="3511031"/>
+                    </a:xfrm>
+                    <a:prstGeom prst="rect">
+                      <a:avLst/>
+                    </a:prstGeom>
+                  </pic:spPr>
+                </pic:pic>
+              </a:graphicData>
+            </a:graphic>
+          </wp:inline>
+        </w:drawing>
+      </w:r>
+    </w:p>
+    <w:p/>
+    <w:p>
+      <w:r>
+        <w:t>Para esta segunda librería es más fácil encontrarla por el nombre del creador</w:t>
+      </w:r>
+    </w:p>
+    <w:p/>
+    <w:p>
+      <w:r>
+        <w:rPr>
+          <w:noProof/>
+        </w:rPr>
+        <w:drawing>
+          <wp:inline distT="0" distB="0" distL="0" distR="0" wp14:anchorId="43351E45" wp14:editId="2C30F880">
+            <wp:extent cx="2434211" cy="3629025"/>
+            <wp:effectExtent l="0" t="0" r="4445" b="0"/>
+            <wp:docPr id="30" name="Imagen 30"/>
+            <wp:cNvGraphicFramePr>
+              <a:graphicFrameLocks xmlns:a="http://schemas.openxmlformats.org/drawingml/2006/main" noChangeAspect="1"/>
+            </wp:cNvGraphicFramePr>
+            <a:graphic xmlns:a="http://schemas.openxmlformats.org/drawingml/2006/main">
+              <a:graphicData uri="http://schemas.openxmlformats.org/drawingml/2006/picture">
+                <pic:pic xmlns:pic="http://schemas.openxmlformats.org/drawingml/2006/picture">
+                  <pic:nvPicPr>
+                    <pic:cNvPr id="30" name="Imagen 30"/>
+                    <pic:cNvPicPr/>
+                  </pic:nvPicPr>
+                  <pic:blipFill>
+                    <a:blip r:embed="rId24">
+                      <a:extLst>
+                        <a:ext uri="{28A0092B-C50C-407E-A947-70E740481C1C}">
+                          <a14:useLocalDpi xmlns:a14="http://schemas.microsoft.com/office/drawing/2010/main" val="0"/>
+                        </a:ext>
+                      </a:extLst>
+                    </a:blip>
+                    <a:stretch>
+                      <a:fillRect/>
+                    </a:stretch>
+                  </pic:blipFill>
+                  <pic:spPr>
+                    <a:xfrm>
+                      <a:off x="0" y="0"/>
+                      <a:ext cx="2444156" cy="3643851"/>
+                    </a:xfrm>
+                    <a:prstGeom prst="rect">
+                      <a:avLst/>
+                    </a:prstGeom>
+                  </pic:spPr>
+                </pic:pic>
+              </a:graphicData>
+            </a:graphic>
+          </wp:inline>
+        </w:drawing>
+      </w:r>
     </w:p>
     <w:p>
       <w:pPr>
         <w:pStyle w:val="Estiloa"/>
-      </w:pPr>
-      <w:r>
         <w:rPr>
           <w:rFonts w:eastAsia="Times New Roman"/>
           <w:lang w:eastAsia="es-CO"/>
         </w:rPr>
+      </w:pPr>
+      <w:r>
+        <w:rPr>
+          <w:rFonts w:eastAsia="Times New Roman"/>
+          <w:lang w:eastAsia="es-CO"/>
+        </w:rPr>
         <w:lastRenderedPageBreak/>
         <w:t xml:space="preserve">Descripción del </w:t>
       </w:r>
@@ -3303,13 +3589,6 @@
           <w:lang w:eastAsia="es-CO"/>
         </w:rPr>
         <w:t>Descripción General</w:t>
-      </w:r>
-      <w:r>
-        <w:rPr>
-          <w:rFonts w:eastAsia="Times New Roman"/>
-          <w:lang w:eastAsia="es-CO"/>
-        </w:rPr>
-        <w:t xml:space="preserve"> (y cambios que realizar)</w:t>
       </w:r>
     </w:p>
     <w:p>
@@ -3329,247 +3608,340 @@
           <w:szCs w:val="24"/>
           <w:lang w:eastAsia="es-CO"/>
         </w:rPr>
-        <w:t>El código para el ESP32 gestiona la conexión a una red Wi-Fi, recibe comandos HTTP para controlar un LED, y envía datos de un sensor DHT11 a una base de datos en MongoDB Atlas.</w:t>
-      </w:r>
-    </w:p>
-    <w:p>
-      <w:pPr>
-        <w:spacing w:before="100" w:beforeAutospacing="1" w:after="100" w:afterAutospacing="1"/>
-        <w:outlineLvl w:val="2"/>
+        <w:t xml:space="preserve">El código para el ESP32 gestiona la conexión a una red </w:t>
+      </w:r>
+      <w:proofErr w:type="spellStart"/>
+      <w:r>
         <w:rPr>
           <w:rFonts w:ascii="Times New Roman" w:eastAsia="Times New Roman" w:hAnsi="Times New Roman" w:cs="Times New Roman"/>
-          <w:b/>
-          <w:bCs/>
-          <w:sz w:val="27"/>
-          <w:szCs w:val="27"/>
+          <w:sz w:val="24"/>
+          <w:szCs w:val="24"/>
           <w:lang w:eastAsia="es-CO"/>
         </w:rPr>
-      </w:pPr>
-    </w:p>
-    <w:p>
-      <w:pPr>
-        <w:spacing w:before="100" w:beforeAutospacing="1" w:after="100" w:afterAutospacing="1"/>
-        <w:outlineLvl w:val="2"/>
+        <w:t>Wi</w:t>
+      </w:r>
+      <w:proofErr w:type="spellEnd"/>
+      <w:r>
         <w:rPr>
           <w:rFonts w:ascii="Times New Roman" w:eastAsia="Times New Roman" w:hAnsi="Times New Roman" w:cs="Times New Roman"/>
-          <w:b/>
-          <w:bCs/>
-          <w:sz w:val="27"/>
-          <w:szCs w:val="27"/>
+          <w:sz w:val="24"/>
+          <w:szCs w:val="24"/>
           <w:lang w:eastAsia="es-CO"/>
         </w:rPr>
-      </w:pPr>
-    </w:p>
-    <w:p>
-      <w:pPr>
-        <w:spacing w:before="100" w:beforeAutospacing="1" w:after="100" w:afterAutospacing="1"/>
-        <w:outlineLvl w:val="2"/>
-        <w:rPr>
-          <w:rFonts w:ascii="Times New Roman" w:eastAsia="Times New Roman" w:hAnsi="Times New Roman" w:cs="Times New Roman"/>
-          <w:b/>
-          <w:bCs/>
-          <w:sz w:val="27"/>
-          <w:szCs w:val="27"/>
-          <w:lang w:eastAsia="es-CO"/>
-        </w:rPr>
-      </w:pPr>
-    </w:p>
-    <w:p>
-      <w:pPr>
-        <w:spacing w:before="100" w:beforeAutospacing="1" w:after="100" w:afterAutospacing="1"/>
-        <w:outlineLvl w:val="2"/>
-        <w:rPr>
-          <w:rFonts w:ascii="Times New Roman" w:eastAsia="Times New Roman" w:hAnsi="Times New Roman" w:cs="Times New Roman"/>
-          <w:b/>
-          <w:bCs/>
-          <w:sz w:val="27"/>
-          <w:szCs w:val="27"/>
-          <w:lang w:eastAsia="es-CO"/>
-        </w:rPr>
-      </w:pPr>
-    </w:p>
-    <w:p>
-      <w:pPr>
-        <w:spacing w:before="100" w:beforeAutospacing="1" w:after="100" w:afterAutospacing="1"/>
-        <w:outlineLvl w:val="2"/>
-        <w:rPr>
-          <w:rFonts w:ascii="Times New Roman" w:eastAsia="Times New Roman" w:hAnsi="Times New Roman" w:cs="Times New Roman"/>
-          <w:b/>
-          <w:bCs/>
-          <w:sz w:val="27"/>
-          <w:szCs w:val="27"/>
-          <w:lang w:eastAsia="es-CO"/>
-        </w:rPr>
-      </w:pPr>
-    </w:p>
-    <w:p>
-      <w:pPr>
-        <w:spacing w:before="100" w:beforeAutospacing="1" w:after="100" w:afterAutospacing="1"/>
-        <w:outlineLvl w:val="2"/>
-        <w:rPr>
-          <w:rFonts w:ascii="Times New Roman" w:eastAsia="Times New Roman" w:hAnsi="Times New Roman" w:cs="Times New Roman"/>
-          <w:b/>
-          <w:bCs/>
-          <w:sz w:val="27"/>
-          <w:szCs w:val="27"/>
-          <w:lang w:eastAsia="es-CO"/>
-        </w:rPr>
-      </w:pPr>
-    </w:p>
-    <w:p>
-      <w:pPr>
-        <w:spacing w:before="100" w:beforeAutospacing="1" w:after="100" w:afterAutospacing="1"/>
-        <w:outlineLvl w:val="2"/>
-        <w:rPr>
-          <w:rFonts w:ascii="Times New Roman" w:eastAsia="Times New Roman" w:hAnsi="Times New Roman" w:cs="Times New Roman"/>
-          <w:b/>
-          <w:bCs/>
-          <w:sz w:val="27"/>
-          <w:szCs w:val="27"/>
-          <w:lang w:eastAsia="es-CO"/>
-        </w:rPr>
-      </w:pPr>
-    </w:p>
-    <w:p>
-      <w:pPr>
-        <w:spacing w:before="100" w:beforeAutospacing="1" w:after="100" w:afterAutospacing="1"/>
-        <w:outlineLvl w:val="2"/>
-        <w:rPr>
-          <w:rFonts w:ascii="Times New Roman" w:eastAsia="Times New Roman" w:hAnsi="Times New Roman" w:cs="Times New Roman"/>
-          <w:b/>
-          <w:bCs/>
-          <w:sz w:val="27"/>
-          <w:szCs w:val="27"/>
-          <w:lang w:eastAsia="es-CO"/>
-        </w:rPr>
-      </w:pPr>
-    </w:p>
-    <w:p>
-      <w:pPr>
-        <w:spacing w:before="100" w:beforeAutospacing="1" w:after="100" w:afterAutospacing="1"/>
-        <w:outlineLvl w:val="2"/>
-        <w:rPr>
-          <w:rFonts w:ascii="Times New Roman" w:eastAsia="Times New Roman" w:hAnsi="Times New Roman" w:cs="Times New Roman"/>
-          <w:b/>
-          <w:bCs/>
-          <w:sz w:val="27"/>
-          <w:szCs w:val="27"/>
-          <w:lang w:eastAsia="es-CO"/>
-        </w:rPr>
-      </w:pPr>
-    </w:p>
-    <w:p>
-      <w:pPr>
-        <w:spacing w:before="100" w:beforeAutospacing="1" w:after="100" w:afterAutospacing="1"/>
-        <w:outlineLvl w:val="2"/>
-        <w:rPr>
-          <w:rFonts w:ascii="Times New Roman" w:eastAsia="Times New Roman" w:hAnsi="Times New Roman" w:cs="Times New Roman"/>
-          <w:b/>
-          <w:bCs/>
-          <w:sz w:val="27"/>
-          <w:szCs w:val="27"/>
-          <w:lang w:eastAsia="es-CO"/>
-        </w:rPr>
-      </w:pPr>
-    </w:p>
-    <w:p>
-      <w:pPr>
-        <w:spacing w:before="100" w:beforeAutospacing="1" w:after="100" w:afterAutospacing="1"/>
-        <w:outlineLvl w:val="2"/>
-        <w:rPr>
-          <w:rFonts w:ascii="Times New Roman" w:eastAsia="Times New Roman" w:hAnsi="Times New Roman" w:cs="Times New Roman"/>
-          <w:b/>
-          <w:bCs/>
-          <w:sz w:val="27"/>
-          <w:szCs w:val="27"/>
-          <w:lang w:eastAsia="es-CO"/>
-        </w:rPr>
-      </w:pPr>
-    </w:p>
-    <w:p>
-      <w:pPr>
-        <w:spacing w:before="100" w:beforeAutospacing="1" w:after="100" w:afterAutospacing="1"/>
-        <w:outlineLvl w:val="2"/>
-        <w:rPr>
-          <w:rFonts w:ascii="Times New Roman" w:eastAsia="Times New Roman" w:hAnsi="Times New Roman" w:cs="Times New Roman"/>
-          <w:b/>
-          <w:bCs/>
-          <w:sz w:val="27"/>
-          <w:szCs w:val="27"/>
-          <w:lang w:eastAsia="es-CO"/>
-        </w:rPr>
-      </w:pPr>
-    </w:p>
-    <w:p>
-      <w:pPr>
-        <w:spacing w:before="100" w:beforeAutospacing="1" w:after="100" w:afterAutospacing="1"/>
-        <w:outlineLvl w:val="2"/>
-        <w:rPr>
-          <w:rFonts w:ascii="Times New Roman" w:eastAsia="Times New Roman" w:hAnsi="Times New Roman" w:cs="Times New Roman"/>
-          <w:b/>
-          <w:bCs/>
-          <w:sz w:val="27"/>
-          <w:szCs w:val="27"/>
-          <w:lang w:eastAsia="es-CO"/>
-        </w:rPr>
-      </w:pPr>
-    </w:p>
-    <w:p>
-      <w:pPr>
-        <w:spacing w:before="100" w:beforeAutospacing="1" w:after="100" w:afterAutospacing="1"/>
-        <w:outlineLvl w:val="2"/>
-        <w:rPr>
-          <w:rFonts w:ascii="Times New Roman" w:eastAsia="Times New Roman" w:hAnsi="Times New Roman" w:cs="Times New Roman"/>
-          <w:b/>
-          <w:bCs/>
-          <w:sz w:val="27"/>
-          <w:szCs w:val="27"/>
-          <w:lang w:eastAsia="es-CO"/>
-        </w:rPr>
-      </w:pPr>
-    </w:p>
-    <w:p>
-      <w:pPr>
-        <w:spacing w:before="100" w:beforeAutospacing="1" w:after="100" w:afterAutospacing="1"/>
-        <w:outlineLvl w:val="2"/>
-        <w:rPr>
-          <w:rFonts w:ascii="Times New Roman" w:eastAsia="Times New Roman" w:hAnsi="Times New Roman" w:cs="Times New Roman"/>
-          <w:b/>
-          <w:bCs/>
-          <w:sz w:val="27"/>
-          <w:szCs w:val="27"/>
-          <w:lang w:eastAsia="es-CO"/>
-        </w:rPr>
-      </w:pPr>
-    </w:p>
-    <w:p>
-      <w:pPr>
-        <w:spacing w:before="100" w:beforeAutospacing="1" w:after="100" w:afterAutospacing="1"/>
-        <w:outlineLvl w:val="2"/>
-        <w:rPr>
-          <w:rFonts w:ascii="Times New Roman" w:eastAsia="Times New Roman" w:hAnsi="Times New Roman" w:cs="Times New Roman"/>
-          <w:b/>
-          <w:bCs/>
-          <w:sz w:val="27"/>
-          <w:szCs w:val="27"/>
-          <w:lang w:eastAsia="es-CO"/>
-        </w:rPr>
-      </w:pPr>
-    </w:p>
-    <w:p>
-      <w:pPr>
-        <w:spacing w:before="100" w:beforeAutospacing="1" w:after="100" w:afterAutospacing="1"/>
-        <w:outlineLvl w:val="2"/>
-        <w:rPr>
-          <w:rFonts w:ascii="Times New Roman" w:eastAsia="Times New Roman" w:hAnsi="Times New Roman" w:cs="Times New Roman"/>
-          <w:b/>
-          <w:bCs/>
-          <w:sz w:val="27"/>
-          <w:szCs w:val="27"/>
-          <w:lang w:eastAsia="es-CO"/>
-        </w:rPr>
-      </w:pPr>
-    </w:p>
+        <w:t>-Fi, recibe comandos HTTP para controlar un LED, y envía datos de un sensor DHT11 a una base de datos en MongoDB Atlas.</w:t>
+      </w:r>
+    </w:p>
+    <w:p>
+      <w:pPr>
+        <w:pStyle w:val="Ttulo3"/>
+        <w:ind w:firstLine="284"/>
+      </w:pPr>
+      <w:r>
+        <w:t>Acceder al código de la placa y editar lo que necesitas</w:t>
+      </w:r>
+    </w:p>
+    <w:p/>
+    <w:p>
+      <w:r>
+        <w:t xml:space="preserve">Cabe aclarar que está en un repositorio, solo descárgalo. </w:t>
+      </w:r>
+    </w:p>
+    <w:p>
+      <w:r>
+        <w:t xml:space="preserve">luego copias la ruta en donde esta, después la pegas en el buscador de archivos, tal que </w:t>
+      </w:r>
+      <w:proofErr w:type="gramStart"/>
+      <w:r>
+        <w:t>así :</w:t>
+      </w:r>
+      <w:proofErr w:type="gramEnd"/>
+    </w:p>
+    <w:p/>
+    <w:p/>
+    <w:p>
+      <w:r>
+        <w:rPr>
+          <w:noProof/>
+        </w:rPr>
+        <w:drawing>
+          <wp:inline distT="0" distB="0" distL="0" distR="0" wp14:anchorId="40C57E91" wp14:editId="739551D2">
+            <wp:extent cx="6159500" cy="1236345"/>
+            <wp:effectExtent l="0" t="0" r="0" b="1905"/>
+            <wp:docPr id="23" name="Imagen 23"/>
+            <wp:cNvGraphicFramePr>
+              <a:graphicFrameLocks xmlns:a="http://schemas.openxmlformats.org/drawingml/2006/main" noChangeAspect="1"/>
+            </wp:cNvGraphicFramePr>
+            <a:graphic xmlns:a="http://schemas.openxmlformats.org/drawingml/2006/main">
+              <a:graphicData uri="http://schemas.openxmlformats.org/drawingml/2006/picture">
+                <pic:pic xmlns:pic="http://schemas.openxmlformats.org/drawingml/2006/picture">
+                  <pic:nvPicPr>
+                    <pic:cNvPr id="16" name="Imagen 16"/>
+                    <pic:cNvPicPr/>
+                  </pic:nvPicPr>
+                  <pic:blipFill>
+                    <a:blip r:embed="rId25">
+                      <a:extLst>
+                        <a:ext uri="{28A0092B-C50C-407E-A947-70E740481C1C}">
+                          <a14:useLocalDpi xmlns:a14="http://schemas.microsoft.com/office/drawing/2010/main" val="0"/>
+                        </a:ext>
+                      </a:extLst>
+                    </a:blip>
+                    <a:stretch>
+                      <a:fillRect/>
+                    </a:stretch>
+                  </pic:blipFill>
+                  <pic:spPr>
+                    <a:xfrm>
+                      <a:off x="0" y="0"/>
+                      <a:ext cx="6159500" cy="1236345"/>
+                    </a:xfrm>
+                    <a:prstGeom prst="rect">
+                      <a:avLst/>
+                    </a:prstGeom>
+                  </pic:spPr>
+                </pic:pic>
+              </a:graphicData>
+            </a:graphic>
+          </wp:inline>
+        </w:drawing>
+      </w:r>
+    </w:p>
+    <w:p/>
+    <w:p>
+      <w:r>
+        <w:rPr>
+          <w:noProof/>
+        </w:rPr>
+        <w:drawing>
+          <wp:inline distT="0" distB="0" distL="0" distR="0" wp14:anchorId="4270DAA1" wp14:editId="7E801758">
+            <wp:extent cx="2438740" cy="3381847"/>
+            <wp:effectExtent l="0" t="0" r="0" b="9525"/>
+            <wp:docPr id="24" name="Imagen 24"/>
+            <wp:cNvGraphicFramePr>
+              <a:graphicFrameLocks xmlns:a="http://schemas.openxmlformats.org/drawingml/2006/main" noChangeAspect="1"/>
+            </wp:cNvGraphicFramePr>
+            <a:graphic xmlns:a="http://schemas.openxmlformats.org/drawingml/2006/main">
+              <a:graphicData uri="http://schemas.openxmlformats.org/drawingml/2006/picture">
+                <pic:pic xmlns:pic="http://schemas.openxmlformats.org/drawingml/2006/picture">
+                  <pic:nvPicPr>
+                    <pic:cNvPr id="17" name="Imagen 17"/>
+                    <pic:cNvPicPr/>
+                  </pic:nvPicPr>
+                  <pic:blipFill>
+                    <a:blip r:embed="rId26">
+                      <a:extLst>
+                        <a:ext uri="{28A0092B-C50C-407E-A947-70E740481C1C}">
+                          <a14:useLocalDpi xmlns:a14="http://schemas.microsoft.com/office/drawing/2010/main" val="0"/>
+                        </a:ext>
+                      </a:extLst>
+                    </a:blip>
+                    <a:stretch>
+                      <a:fillRect/>
+                    </a:stretch>
+                  </pic:blipFill>
+                  <pic:spPr>
+                    <a:xfrm>
+                      <a:off x="0" y="0"/>
+                      <a:ext cx="2438740" cy="3381847"/>
+                    </a:xfrm>
+                    <a:prstGeom prst="rect">
+                      <a:avLst/>
+                    </a:prstGeom>
+                  </pic:spPr>
+                </pic:pic>
+              </a:graphicData>
+            </a:graphic>
+          </wp:inline>
+        </w:drawing>
+      </w:r>
+    </w:p>
+    <w:p/>
+    <w:p/>
+    <w:p/>
+    <w:p/>
+    <w:p/>
+    <w:p/>
+    <w:p>
+      <w:r>
+        <w:lastRenderedPageBreak/>
+        <w:t>Veras algo como esto:</w:t>
+      </w:r>
+    </w:p>
+    <w:p/>
+    <w:p>
+      <w:r>
+        <w:rPr>
+          <w:noProof/>
+        </w:rPr>
+        <w:drawing>
+          <wp:inline distT="0" distB="0" distL="0" distR="0" wp14:anchorId="130C8867" wp14:editId="62D98D97">
+            <wp:extent cx="6159500" cy="1522730"/>
+            <wp:effectExtent l="0" t="0" r="0" b="1270"/>
+            <wp:docPr id="25" name="Imagen 25"/>
+            <wp:cNvGraphicFramePr>
+              <a:graphicFrameLocks xmlns:a="http://schemas.openxmlformats.org/drawingml/2006/main" noChangeAspect="1"/>
+            </wp:cNvGraphicFramePr>
+            <a:graphic xmlns:a="http://schemas.openxmlformats.org/drawingml/2006/main">
+              <a:graphicData uri="http://schemas.openxmlformats.org/drawingml/2006/picture">
+                <pic:pic xmlns:pic="http://schemas.openxmlformats.org/drawingml/2006/picture">
+                  <pic:nvPicPr>
+                    <pic:cNvPr id="18" name="Imagen 18"/>
+                    <pic:cNvPicPr/>
+                  </pic:nvPicPr>
+                  <pic:blipFill>
+                    <a:blip r:embed="rId27">
+                      <a:extLst>
+                        <a:ext uri="{28A0092B-C50C-407E-A947-70E740481C1C}">
+                          <a14:useLocalDpi xmlns:a14="http://schemas.microsoft.com/office/drawing/2010/main" val="0"/>
+                        </a:ext>
+                      </a:extLst>
+                    </a:blip>
+                    <a:stretch>
+                      <a:fillRect/>
+                    </a:stretch>
+                  </pic:blipFill>
+                  <pic:spPr>
+                    <a:xfrm>
+                      <a:off x="0" y="0"/>
+                      <a:ext cx="6159500" cy="1522730"/>
+                    </a:xfrm>
+                    <a:prstGeom prst="rect">
+                      <a:avLst/>
+                    </a:prstGeom>
+                  </pic:spPr>
+                </pic:pic>
+              </a:graphicData>
+            </a:graphic>
+          </wp:inline>
+        </w:drawing>
+      </w:r>
+    </w:p>
+    <w:p/>
+    <w:p>
+      <w:pPr>
+        <w:rPr>
+          <w:noProof/>
+        </w:rPr>
+      </w:pPr>
+      <w:r>
+        <w:rPr>
+          <w:noProof/>
+        </w:rPr>
+        <w:t>Pegas la ruta donde se encuentra el archivo del repositorio</w:t>
+      </w:r>
+    </w:p>
+    <w:p>
+      <w:pPr>
+        <w:rPr>
+          <w:noProof/>
+        </w:rPr>
+      </w:pPr>
+    </w:p>
+    <w:p>
+      <w:r>
+        <w:rPr>
+          <w:noProof/>
+        </w:rPr>
+        <w:drawing>
+          <wp:inline distT="0" distB="0" distL="0" distR="0" wp14:anchorId="5120B4A5" wp14:editId="0ED2A51F">
+            <wp:extent cx="6159500" cy="1200150"/>
+            <wp:effectExtent l="0" t="0" r="0" b="0"/>
+            <wp:docPr id="28" name="Imagen 28"/>
+            <wp:cNvGraphicFramePr>
+              <a:graphicFrameLocks xmlns:a="http://schemas.openxmlformats.org/drawingml/2006/main" noChangeAspect="1"/>
+            </wp:cNvGraphicFramePr>
+            <a:graphic xmlns:a="http://schemas.openxmlformats.org/drawingml/2006/main">
+              <a:graphicData uri="http://schemas.openxmlformats.org/drawingml/2006/picture">
+                <pic:pic xmlns:pic="http://schemas.openxmlformats.org/drawingml/2006/picture">
+                  <pic:nvPicPr>
+                    <pic:cNvPr id="28" name="Imagen 28"/>
+                    <pic:cNvPicPr/>
+                  </pic:nvPicPr>
+                  <pic:blipFill>
+                    <a:blip r:embed="rId28">
+                      <a:extLst>
+                        <a:ext uri="{28A0092B-C50C-407E-A947-70E740481C1C}">
+                          <a14:useLocalDpi xmlns:a14="http://schemas.microsoft.com/office/drawing/2010/main" val="0"/>
+                        </a:ext>
+                      </a:extLst>
+                    </a:blip>
+                    <a:stretch>
+                      <a:fillRect/>
+                    </a:stretch>
+                  </pic:blipFill>
+                  <pic:spPr>
+                    <a:xfrm>
+                      <a:off x="0" y="0"/>
+                      <a:ext cx="6159500" cy="1200150"/>
+                    </a:xfrm>
+                    <a:prstGeom prst="rect">
+                      <a:avLst/>
+                    </a:prstGeom>
+                  </pic:spPr>
+                </pic:pic>
+              </a:graphicData>
+            </a:graphic>
+          </wp:inline>
+        </w:drawing>
+      </w:r>
+    </w:p>
+    <w:p/>
+    <w:p>
+      <w:r>
+        <w:t>Y ya tienes todo configurado</w:t>
+      </w:r>
+    </w:p>
+    <w:p/>
+    <w:p>
+      <w:r>
+        <w:rPr>
+          <w:noProof/>
+        </w:rPr>
+        <w:drawing>
+          <wp:inline distT="0" distB="0" distL="0" distR="0" wp14:anchorId="666A215F" wp14:editId="44B998F7">
+            <wp:extent cx="6610350" cy="3457356"/>
+            <wp:effectExtent l="0" t="0" r="0" b="0"/>
+            <wp:docPr id="27" name="Imagen 27"/>
+            <wp:cNvGraphicFramePr>
+              <a:graphicFrameLocks xmlns:a="http://schemas.openxmlformats.org/drawingml/2006/main" noChangeAspect="1"/>
+            </wp:cNvGraphicFramePr>
+            <a:graphic xmlns:a="http://schemas.openxmlformats.org/drawingml/2006/main">
+              <a:graphicData uri="http://schemas.openxmlformats.org/drawingml/2006/picture">
+                <pic:pic xmlns:pic="http://schemas.openxmlformats.org/drawingml/2006/picture">
+                  <pic:nvPicPr>
+                    <pic:cNvPr id="20" name="Imagen 20"/>
+                    <pic:cNvPicPr/>
+                  </pic:nvPicPr>
+                  <pic:blipFill>
+                    <a:blip r:embed="rId29">
+                      <a:extLst>
+                        <a:ext uri="{28A0092B-C50C-407E-A947-70E740481C1C}">
+                          <a14:useLocalDpi xmlns:a14="http://schemas.microsoft.com/office/drawing/2010/main" val="0"/>
+                        </a:ext>
+                      </a:extLst>
+                    </a:blip>
+                    <a:stretch>
+                      <a:fillRect/>
+                    </a:stretch>
+                  </pic:blipFill>
+                  <pic:spPr>
+                    <a:xfrm>
+                      <a:off x="0" y="0"/>
+                      <a:ext cx="6650305" cy="3478254"/>
+                    </a:xfrm>
+                    <a:prstGeom prst="rect">
+                      <a:avLst/>
+                    </a:prstGeom>
+                  </pic:spPr>
+                </pic:pic>
+              </a:graphicData>
+            </a:graphic>
+          </wp:inline>
+        </w:drawing>
+      </w:r>
+    </w:p>
+    <w:p/>
+    <w:p/>
     <w:p>
       <w:pPr>
         <w:spacing w:before="100" w:beforeAutospacing="1" w:after="100" w:afterAutospacing="1"/>
@@ -3598,6 +3970,247 @@
           <w:lang w:eastAsia="es-CO"/>
         </w:rPr>
         <w:lastRenderedPageBreak/>
+        <w:t>Continuara….</w:t>
+      </w:r>
+    </w:p>
+    <w:p>
+      <w:pPr>
+        <w:spacing w:before="100" w:beforeAutospacing="1" w:after="100" w:afterAutospacing="1"/>
+        <w:outlineLvl w:val="2"/>
+        <w:rPr>
+          <w:rFonts w:ascii="Times New Roman" w:eastAsia="Times New Roman" w:hAnsi="Times New Roman" w:cs="Times New Roman"/>
+          <w:b/>
+          <w:bCs/>
+          <w:sz w:val="36"/>
+          <w:szCs w:val="36"/>
+          <w:lang w:eastAsia="es-CO"/>
+        </w:rPr>
+      </w:pPr>
+    </w:p>
+    <w:p>
+      <w:pPr>
+        <w:spacing w:before="100" w:beforeAutospacing="1" w:after="100" w:afterAutospacing="1"/>
+        <w:outlineLvl w:val="2"/>
+        <w:rPr>
+          <w:rFonts w:ascii="Times New Roman" w:eastAsia="Times New Roman" w:hAnsi="Times New Roman" w:cs="Times New Roman"/>
+          <w:b/>
+          <w:bCs/>
+          <w:sz w:val="36"/>
+          <w:szCs w:val="36"/>
+          <w:lang w:eastAsia="es-CO"/>
+        </w:rPr>
+      </w:pPr>
+    </w:p>
+    <w:p>
+      <w:pPr>
+        <w:spacing w:before="100" w:beforeAutospacing="1" w:after="100" w:afterAutospacing="1"/>
+        <w:outlineLvl w:val="2"/>
+        <w:rPr>
+          <w:rFonts w:ascii="Times New Roman" w:eastAsia="Times New Roman" w:hAnsi="Times New Roman" w:cs="Times New Roman"/>
+          <w:b/>
+          <w:bCs/>
+          <w:sz w:val="36"/>
+          <w:szCs w:val="36"/>
+          <w:lang w:eastAsia="es-CO"/>
+        </w:rPr>
+      </w:pPr>
+    </w:p>
+    <w:p>
+      <w:pPr>
+        <w:spacing w:before="100" w:beforeAutospacing="1" w:after="100" w:afterAutospacing="1"/>
+        <w:outlineLvl w:val="2"/>
+        <w:rPr>
+          <w:rFonts w:ascii="Times New Roman" w:eastAsia="Times New Roman" w:hAnsi="Times New Roman" w:cs="Times New Roman"/>
+          <w:b/>
+          <w:bCs/>
+          <w:sz w:val="36"/>
+          <w:szCs w:val="36"/>
+          <w:lang w:eastAsia="es-CO"/>
+        </w:rPr>
+      </w:pPr>
+    </w:p>
+    <w:p>
+      <w:pPr>
+        <w:spacing w:before="100" w:beforeAutospacing="1" w:after="100" w:afterAutospacing="1"/>
+        <w:outlineLvl w:val="2"/>
+        <w:rPr>
+          <w:rFonts w:ascii="Times New Roman" w:eastAsia="Times New Roman" w:hAnsi="Times New Roman" w:cs="Times New Roman"/>
+          <w:b/>
+          <w:bCs/>
+          <w:sz w:val="36"/>
+          <w:szCs w:val="36"/>
+          <w:lang w:eastAsia="es-CO"/>
+        </w:rPr>
+      </w:pPr>
+    </w:p>
+    <w:p>
+      <w:pPr>
+        <w:spacing w:before="100" w:beforeAutospacing="1" w:after="100" w:afterAutospacing="1"/>
+        <w:outlineLvl w:val="2"/>
+        <w:rPr>
+          <w:rFonts w:ascii="Times New Roman" w:eastAsia="Times New Roman" w:hAnsi="Times New Roman" w:cs="Times New Roman"/>
+          <w:b/>
+          <w:bCs/>
+          <w:sz w:val="36"/>
+          <w:szCs w:val="36"/>
+          <w:lang w:eastAsia="es-CO"/>
+        </w:rPr>
+      </w:pPr>
+    </w:p>
+    <w:p>
+      <w:pPr>
+        <w:spacing w:before="100" w:beforeAutospacing="1" w:after="100" w:afterAutospacing="1"/>
+        <w:outlineLvl w:val="2"/>
+        <w:rPr>
+          <w:rFonts w:ascii="Times New Roman" w:eastAsia="Times New Roman" w:hAnsi="Times New Roman" w:cs="Times New Roman"/>
+          <w:b/>
+          <w:bCs/>
+          <w:sz w:val="36"/>
+          <w:szCs w:val="36"/>
+          <w:lang w:eastAsia="es-CO"/>
+        </w:rPr>
+      </w:pPr>
+    </w:p>
+    <w:p>
+      <w:pPr>
+        <w:spacing w:before="100" w:beforeAutospacing="1" w:after="100" w:afterAutospacing="1"/>
+        <w:outlineLvl w:val="2"/>
+        <w:rPr>
+          <w:rFonts w:ascii="Times New Roman" w:eastAsia="Times New Roman" w:hAnsi="Times New Roman" w:cs="Times New Roman"/>
+          <w:b/>
+          <w:bCs/>
+          <w:sz w:val="36"/>
+          <w:szCs w:val="36"/>
+          <w:lang w:eastAsia="es-CO"/>
+        </w:rPr>
+      </w:pPr>
+    </w:p>
+    <w:p>
+      <w:pPr>
+        <w:spacing w:before="100" w:beforeAutospacing="1" w:after="100" w:afterAutospacing="1"/>
+        <w:outlineLvl w:val="2"/>
+        <w:rPr>
+          <w:rFonts w:ascii="Times New Roman" w:eastAsia="Times New Roman" w:hAnsi="Times New Roman" w:cs="Times New Roman"/>
+          <w:b/>
+          <w:bCs/>
+          <w:sz w:val="36"/>
+          <w:szCs w:val="36"/>
+          <w:lang w:eastAsia="es-CO"/>
+        </w:rPr>
+      </w:pPr>
+    </w:p>
+    <w:p>
+      <w:pPr>
+        <w:spacing w:before="100" w:beforeAutospacing="1" w:after="100" w:afterAutospacing="1"/>
+        <w:outlineLvl w:val="2"/>
+        <w:rPr>
+          <w:rFonts w:ascii="Times New Roman" w:eastAsia="Times New Roman" w:hAnsi="Times New Roman" w:cs="Times New Roman"/>
+          <w:b/>
+          <w:bCs/>
+          <w:sz w:val="36"/>
+          <w:szCs w:val="36"/>
+          <w:lang w:eastAsia="es-CO"/>
+        </w:rPr>
+      </w:pPr>
+    </w:p>
+    <w:p>
+      <w:pPr>
+        <w:spacing w:before="100" w:beforeAutospacing="1" w:after="100" w:afterAutospacing="1"/>
+        <w:outlineLvl w:val="2"/>
+        <w:rPr>
+          <w:rFonts w:ascii="Times New Roman" w:eastAsia="Times New Roman" w:hAnsi="Times New Roman" w:cs="Times New Roman"/>
+          <w:b/>
+          <w:bCs/>
+          <w:sz w:val="36"/>
+          <w:szCs w:val="36"/>
+          <w:lang w:eastAsia="es-CO"/>
+        </w:rPr>
+      </w:pPr>
+    </w:p>
+    <w:p>
+      <w:pPr>
+        <w:spacing w:before="100" w:beforeAutospacing="1" w:after="100" w:afterAutospacing="1"/>
+        <w:outlineLvl w:val="2"/>
+        <w:rPr>
+          <w:rFonts w:ascii="Times New Roman" w:eastAsia="Times New Roman" w:hAnsi="Times New Roman" w:cs="Times New Roman"/>
+          <w:b/>
+          <w:bCs/>
+          <w:sz w:val="36"/>
+          <w:szCs w:val="36"/>
+          <w:lang w:eastAsia="es-CO"/>
+        </w:rPr>
+      </w:pPr>
+    </w:p>
+    <w:p>
+      <w:pPr>
+        <w:spacing w:before="100" w:beforeAutospacing="1" w:after="100" w:afterAutospacing="1"/>
+        <w:outlineLvl w:val="2"/>
+        <w:rPr>
+          <w:rFonts w:ascii="Times New Roman" w:eastAsia="Times New Roman" w:hAnsi="Times New Roman" w:cs="Times New Roman"/>
+          <w:b/>
+          <w:bCs/>
+          <w:sz w:val="36"/>
+          <w:szCs w:val="36"/>
+          <w:lang w:eastAsia="es-CO"/>
+        </w:rPr>
+      </w:pPr>
+    </w:p>
+    <w:p>
+      <w:pPr>
+        <w:spacing w:before="100" w:beforeAutospacing="1" w:after="100" w:afterAutospacing="1"/>
+        <w:outlineLvl w:val="2"/>
+        <w:rPr>
+          <w:rFonts w:ascii="Times New Roman" w:eastAsia="Times New Roman" w:hAnsi="Times New Roman" w:cs="Times New Roman"/>
+          <w:b/>
+          <w:bCs/>
+          <w:sz w:val="36"/>
+          <w:szCs w:val="36"/>
+          <w:lang w:eastAsia="es-CO"/>
+        </w:rPr>
+      </w:pPr>
+    </w:p>
+    <w:p>
+      <w:pPr>
+        <w:spacing w:before="100" w:beforeAutospacing="1" w:after="100" w:afterAutospacing="1"/>
+        <w:outlineLvl w:val="2"/>
+        <w:rPr>
+          <w:rFonts w:ascii="Times New Roman" w:eastAsia="Times New Roman" w:hAnsi="Times New Roman" w:cs="Times New Roman"/>
+          <w:b/>
+          <w:bCs/>
+          <w:sz w:val="36"/>
+          <w:szCs w:val="36"/>
+          <w:lang w:eastAsia="es-CO"/>
+        </w:rPr>
+      </w:pPr>
+    </w:p>
+    <w:p>
+      <w:pPr>
+        <w:spacing w:before="100" w:beforeAutospacing="1" w:after="100" w:afterAutospacing="1"/>
+        <w:outlineLvl w:val="2"/>
+        <w:rPr>
+          <w:rFonts w:ascii="Times New Roman" w:eastAsia="Times New Roman" w:hAnsi="Times New Roman" w:cs="Times New Roman"/>
+          <w:b/>
+          <w:bCs/>
+          <w:sz w:val="36"/>
+          <w:szCs w:val="36"/>
+          <w:lang w:eastAsia="es-CO"/>
+        </w:rPr>
+      </w:pPr>
+    </w:p>
+    <w:p>
+      <w:pPr>
+        <w:pStyle w:val="Estiloa"/>
+        <w:rPr>
+          <w:rFonts w:eastAsia="Times New Roman"/>
+          <w:lang w:eastAsia="es-CO"/>
+        </w:rPr>
+      </w:pPr>
+      <w:r>
+        <w:rPr>
+          <w:rFonts w:eastAsia="Times New Roman"/>
+          <w:lang w:eastAsia="es-CO"/>
+        </w:rPr>
+        <w:lastRenderedPageBreak/>
         <w:t>Recursos Adicionales</w:t>
       </w:r>
     </w:p>
@@ -3618,7 +4231,7 @@
       <w:r>
         <w:t xml:space="preserve"> </w:t>
       </w:r>
-      <w:hyperlink r:id="rId14" w:tgtFrame="_new" w:history="1">
+      <w:hyperlink r:id="rId30" w:tgtFrame="_new" w:history="1">
         <w:r>
           <w:rPr>
             <w:rStyle w:val="Hipervnculo"/>
@@ -3647,7 +4260,7 @@
       <w:r>
         <w:t xml:space="preserve"> </w:t>
       </w:r>
-      <w:hyperlink r:id="rId15" w:tgtFrame="_new" w:history="1">
+      <w:hyperlink r:id="rId31" w:tgtFrame="_new" w:history="1">
         <w:r>
           <w:rPr>
             <w:rStyle w:val="Hipervnculo"/>
@@ -3676,7 +4289,7 @@
       <w:r>
         <w:t xml:space="preserve"> </w:t>
       </w:r>
-      <w:hyperlink r:id="rId16" w:tgtFrame="_new" w:history="1">
+      <w:hyperlink r:id="rId32" w:tgtFrame="_new" w:history="1">
         <w:r>
           <w:rPr>
             <w:rStyle w:val="Hipervnculo"/>
@@ -3705,7 +4318,7 @@
       <w:r>
         <w:t xml:space="preserve"> </w:t>
       </w:r>
-      <w:hyperlink r:id="rId17" w:tgtFrame="_new" w:history="1">
+      <w:hyperlink r:id="rId33" w:tgtFrame="_new" w:history="1">
         <w:r>
           <w:rPr>
             <w:rStyle w:val="Hipervnculo"/>
@@ -3734,7 +4347,7 @@
       <w:r>
         <w:t xml:space="preserve"> </w:t>
       </w:r>
-      <w:hyperlink r:id="rId18" w:tgtFrame="_new" w:history="1">
+      <w:hyperlink r:id="rId34" w:tgtFrame="_new" w:history="1">
         <w:r>
           <w:rPr>
             <w:rStyle w:val="Hipervnculo"/>
@@ -3879,7 +4492,27 @@
           <w:szCs w:val="24"/>
           <w:lang w:eastAsia="es-CO"/>
         </w:rPr>
-        <w:t>Conectar el ESP32 a la red Wi-Fi.</w:t>
+        <w:t xml:space="preserve">Conectar el ESP32 a la red </w:t>
+      </w:r>
+      <w:proofErr w:type="spellStart"/>
+      <w:r>
+        <w:rPr>
+          <w:rFonts w:ascii="Times New Roman" w:eastAsia="Times New Roman" w:hAnsi="Times New Roman" w:cs="Times New Roman"/>
+          <w:sz w:val="24"/>
+          <w:szCs w:val="24"/>
+          <w:lang w:eastAsia="es-CO"/>
+        </w:rPr>
+        <w:t>Wi</w:t>
+      </w:r>
+      <w:proofErr w:type="spellEnd"/>
+      <w:r>
+        <w:rPr>
+          <w:rFonts w:ascii="Times New Roman" w:eastAsia="Times New Roman" w:hAnsi="Times New Roman" w:cs="Times New Roman"/>
+          <w:sz w:val="24"/>
+          <w:szCs w:val="24"/>
+          <w:lang w:eastAsia="es-CO"/>
+        </w:rPr>
+        <w:t>-Fi.</w:t>
       </w:r>
     </w:p>
     <w:p>
@@ -3957,7 +4590,27 @@
           <w:szCs w:val="24"/>
           <w:lang w:eastAsia="es-CO"/>
         </w:rPr>
-        <w:t>Utilizar la aplicación Flutter para enviar comandos al ESP32 y controlar el LED.</w:t>
+        <w:t xml:space="preserve">Utilizar la aplicación </w:t>
+      </w:r>
+      <w:proofErr w:type="spellStart"/>
+      <w:r>
+        <w:rPr>
+          <w:rFonts w:ascii="Times New Roman" w:eastAsia="Times New Roman" w:hAnsi="Times New Roman" w:cs="Times New Roman"/>
+          <w:sz w:val="24"/>
+          <w:szCs w:val="24"/>
+          <w:lang w:eastAsia="es-CO"/>
+        </w:rPr>
+        <w:t>Flutter</w:t>
+      </w:r>
+      <w:proofErr w:type="spellEnd"/>
+      <w:r>
+        <w:rPr>
+          <w:rFonts w:ascii="Times New Roman" w:eastAsia="Times New Roman" w:hAnsi="Times New Roman" w:cs="Times New Roman"/>
+          <w:sz w:val="24"/>
+          <w:szCs w:val="24"/>
+          <w:lang w:eastAsia="es-CO"/>
+        </w:rPr>
+        <w:t xml:space="preserve"> para enviar comandos al ESP32 y controlar el LED.</w:t>
       </w:r>
       <w:r>
         <w:rPr>
@@ -4018,7 +4671,27 @@
           <w:szCs w:val="24"/>
           <w:lang w:eastAsia="es-CO"/>
         </w:rPr>
-        <w:t>El LED debe encenderse al recibir el comando "on".</w:t>
+        <w:t>El LED debe encenderse al recibir el comando "</w:t>
+      </w:r>
+      <w:proofErr w:type="spellStart"/>
+      <w:r>
+        <w:rPr>
+          <w:rFonts w:ascii="Times New Roman" w:eastAsia="Times New Roman" w:hAnsi="Times New Roman" w:cs="Times New Roman"/>
+          <w:sz w:val="24"/>
+          <w:szCs w:val="24"/>
+          <w:lang w:eastAsia="es-CO"/>
+        </w:rPr>
+        <w:t>on</w:t>
+      </w:r>
+      <w:proofErr w:type="spellEnd"/>
+      <w:r>
+        <w:rPr>
+          <w:rFonts w:ascii="Times New Roman" w:eastAsia="Times New Roman" w:hAnsi="Times New Roman" w:cs="Times New Roman"/>
+          <w:sz w:val="24"/>
+          <w:szCs w:val="24"/>
+          <w:lang w:eastAsia="es-CO"/>
+        </w:rPr>
+        <w:t>".</w:t>
       </w:r>
     </w:p>
     <w:p>
@@ -4507,16 +5180,14 @@
               </w:rPr>
               <w:t>2024</w:t>
             </w:r>
-            <w:bookmarkStart w:id="0" w:name="_GoBack"/>
-            <w:bookmarkEnd w:id="0"/>
           </w:p>
         </w:tc>
       </w:tr>
     </w:tbl>
     <w:p/>
     <w:sectPr>
-      <w:headerReference w:type="default" r:id="rId19"/>
-      <w:footerReference w:type="default" r:id="rId20"/>
+      <w:headerReference w:type="default" r:id="rId35"/>
+      <w:footerReference w:type="default" r:id="rId36"/>
       <w:pgSz w:w="12240" w:h="15840"/>
       <w:pgMar w:top="780" w:right="960" w:bottom="280" w:left="1580" w:header="720" w:footer="720" w:gutter="0"/>
       <w:cols w:space="720"/>
@@ -4526,7 +5197,7 @@
 </file>
 
 <file path=word/endnotes.xml><?xml version="1.0" encoding="utf-8"?>
-<w:endnotes xmlns:wpc="http://schemas.microsoft.com/office/word/2010/wordprocessingCanvas" xmlns:cx="http://schemas.microsoft.com/office/drawing/2014/chartex" xmlns:mc="http://schemas.openxmlformats.org/markup-compatibility/2006" xmlns:o="urn:schemas-microsoft-com:office:office" xmlns:r="http://schemas.openxmlformats.org/officeDocument/2006/relationships" xmlns:m="http://schemas.openxmlformats.org/officeDocument/2006/math" xmlns:v="urn:schemas-microsoft-com:vml" xmlns:wp14="http://schemas.microsoft.com/office/word/2010/wordprocessingDrawing" xmlns:wp="http://schemas.openxmlformats.org/drawingml/2006/wordprocessingDrawing" xmlns:w10="urn:schemas-microsoft-com:office:word" xmlns:w="http://schemas.openxmlformats.org/wordprocessingml/2006/main" xmlns:w14="http://schemas.microsoft.com/office/word/2010/wordml" xmlns:w15="http://schemas.microsoft.com/office/word/2012/wordml" xmlns:w16se="http://schemas.microsoft.com/office/word/2015/wordml/symex" xmlns:wpg="http://schemas.microsoft.com/office/word/2010/wordprocessingGroup" xmlns:wpi="http://schemas.microsoft.com/office/word/2010/wordprocessingInk" xmlns:wne="http://schemas.microsoft.com/office/word/2006/wordml" xmlns:wps="http://schemas.microsoft.com/office/word/2010/wordprocessingShape" mc:Ignorable="w14 w15 w16se wp14">
+<w:endnotes xmlns:wpc="http://schemas.microsoft.com/office/word/2010/wordprocessingCanvas" xmlns:cx="http://schemas.microsoft.com/office/drawing/2014/chartex" xmlns:cx1="http://schemas.microsoft.com/office/drawing/2015/9/8/chartex" xmlns:cx2="http://schemas.microsoft.com/office/drawing/2015/10/21/chartex" xmlns:cx3="http://schemas.microsoft.com/office/drawing/2016/5/9/chartex" xmlns:cx4="http://schemas.microsoft.com/office/drawing/2016/5/10/chartex" xmlns:cx5="http://schemas.microsoft.com/office/drawing/2016/5/11/chartex" xmlns:cx6="http://schemas.microsoft.com/office/drawing/2016/5/12/chartex" xmlns:cx7="http://schemas.microsoft.com/office/drawing/2016/5/13/chartex" xmlns:cx8="http://schemas.microsoft.com/office/drawing/2016/5/14/chartex" xmlns:mc="http://schemas.openxmlformats.org/markup-compatibility/2006" xmlns:aink="http://schemas.microsoft.com/office/drawing/2016/ink" xmlns:am3d="http://schemas.microsoft.com/office/drawing/2017/model3d" xmlns:o="urn:schemas-microsoft-com:office:office" xmlns:r="http://schemas.openxmlformats.org/officeDocument/2006/relationships" xmlns:m="http://schemas.openxmlformats.org/officeDocument/2006/math" xmlns:v="urn:schemas-microsoft-com:vml" xmlns:wp14="http://schemas.microsoft.com/office/word/2010/wordprocessingDrawing" xmlns:wp="http://schemas.openxmlformats.org/drawingml/2006/wordprocessingDrawing" xmlns:w10="urn:schemas-microsoft-com:office:word" xmlns:w="http://schemas.openxmlformats.org/wordprocessingml/2006/main" xmlns:w14="http://schemas.microsoft.com/office/word/2010/wordml" xmlns:w15="http://schemas.microsoft.com/office/word/2012/wordml" xmlns:w16cex="http://schemas.microsoft.com/office/word/2018/wordml/cex" xmlns:w16cid="http://schemas.microsoft.com/office/word/2016/wordml/cid" xmlns:w16="http://schemas.microsoft.com/office/word/2018/wordml" xmlns:w16sdtdh="http://schemas.microsoft.com/office/word/2020/wordml/sdtdatahash" xmlns:w16se="http://schemas.microsoft.com/office/word/2015/wordml/symex" xmlns:wpg="http://schemas.microsoft.com/office/word/2010/wordprocessingGroup" xmlns:wpi="http://schemas.microsoft.com/office/word/2010/wordprocessingInk" xmlns:wne="http://schemas.microsoft.com/office/word/2006/wordml" xmlns:wps="http://schemas.microsoft.com/office/word/2010/wordprocessingShape" mc:Ignorable="w14 w15 w16se w16cid w16 w16cex w16sdtdh wp14">
   <w:endnote w:type="separator" w:id="-1">
     <w:p>
       <w:r>
@@ -4545,7 +5216,7 @@
 </file>
 
 <file path=word/footer1.xml><?xml version="1.0" encoding="utf-8"?>
-<w:ftr xmlns:wpc="http://schemas.microsoft.com/office/word/2010/wordprocessingCanvas" xmlns:cx="http://schemas.microsoft.com/office/drawing/2014/chartex" xmlns:mc="http://schemas.openxmlformats.org/markup-compatibility/2006" xmlns:o="urn:schemas-microsoft-com:office:office" xmlns:r="http://schemas.openxmlformats.org/officeDocument/2006/relationships" xmlns:m="http://schemas.openxmlformats.org/officeDocument/2006/math" xmlns:v="urn:schemas-microsoft-com:vml" xmlns:wp14="http://schemas.microsoft.com/office/word/2010/wordprocessingDrawing" xmlns:wp="http://schemas.openxmlformats.org/drawingml/2006/wordprocessingDrawing" xmlns:w10="urn:schemas-microsoft-com:office:word" xmlns:w="http://schemas.openxmlformats.org/wordprocessingml/2006/main" xmlns:w14="http://schemas.microsoft.com/office/word/2010/wordml" xmlns:w15="http://schemas.microsoft.com/office/word/2012/wordml" xmlns:w16se="http://schemas.microsoft.com/office/word/2015/wordml/symex" xmlns:wpg="http://schemas.microsoft.com/office/word/2010/wordprocessingGroup" xmlns:wpi="http://schemas.microsoft.com/office/word/2010/wordprocessingInk" xmlns:wne="http://schemas.microsoft.com/office/word/2006/wordml" xmlns:wps="http://schemas.microsoft.com/office/word/2010/wordprocessingShape" mc:Ignorable="w14 w15 w16se wp14">
+<w:ftr xmlns:wpc="http://schemas.microsoft.com/office/word/2010/wordprocessingCanvas" xmlns:cx="http://schemas.microsoft.com/office/drawing/2014/chartex" xmlns:cx1="http://schemas.microsoft.com/office/drawing/2015/9/8/chartex" xmlns:cx2="http://schemas.microsoft.com/office/drawing/2015/10/21/chartex" xmlns:cx3="http://schemas.microsoft.com/office/drawing/2016/5/9/chartex" xmlns:cx4="http://schemas.microsoft.com/office/drawing/2016/5/10/chartex" xmlns:cx5="http://schemas.microsoft.com/office/drawing/2016/5/11/chartex" xmlns:cx6="http://schemas.microsoft.com/office/drawing/2016/5/12/chartex" xmlns:cx7="http://schemas.microsoft.com/office/drawing/2016/5/13/chartex" xmlns:cx8="http://schemas.microsoft.com/office/drawing/2016/5/14/chartex" xmlns:mc="http://schemas.openxmlformats.org/markup-compatibility/2006" xmlns:aink="http://schemas.microsoft.com/office/drawing/2016/ink" xmlns:am3d="http://schemas.microsoft.com/office/drawing/2017/model3d" xmlns:o="urn:schemas-microsoft-com:office:office" xmlns:r="http://schemas.openxmlformats.org/officeDocument/2006/relationships" xmlns:m="http://schemas.openxmlformats.org/officeDocument/2006/math" xmlns:v="urn:schemas-microsoft-com:vml" xmlns:wp14="http://schemas.microsoft.com/office/word/2010/wordprocessingDrawing" xmlns:wp="http://schemas.openxmlformats.org/drawingml/2006/wordprocessingDrawing" xmlns:w10="urn:schemas-microsoft-com:office:word" xmlns:w="http://schemas.openxmlformats.org/wordprocessingml/2006/main" xmlns:w14="http://schemas.microsoft.com/office/word/2010/wordml" xmlns:w15="http://schemas.microsoft.com/office/word/2012/wordml" xmlns:w16cex="http://schemas.microsoft.com/office/word/2018/wordml/cex" xmlns:w16cid="http://schemas.microsoft.com/office/word/2016/wordml/cid" xmlns:w16="http://schemas.microsoft.com/office/word/2018/wordml" xmlns:w16sdtdh="http://schemas.microsoft.com/office/word/2020/wordml/sdtdatahash" xmlns:w16se="http://schemas.microsoft.com/office/word/2015/wordml/symex" xmlns:wpg="http://schemas.microsoft.com/office/word/2010/wordprocessingGroup" xmlns:wpi="http://schemas.microsoft.com/office/word/2010/wordprocessingInk" xmlns:wne="http://schemas.microsoft.com/office/word/2006/wordml" xmlns:wps="http://schemas.microsoft.com/office/word/2010/wordprocessingShape" mc:Ignorable="w14 w15 w16se w16cid w16 w16cex w16sdtdh wp14">
   <w:p>
     <w:pPr>
       <w:pStyle w:val="Piedepgina"/>
@@ -4567,7 +5238,7 @@
 </file>
 
 <file path=word/footnotes.xml><?xml version="1.0" encoding="utf-8"?>
-<w:footnotes xmlns:wpc="http://schemas.microsoft.com/office/word/2010/wordprocessingCanvas" xmlns:cx="http://schemas.microsoft.com/office/drawing/2014/chartex" xmlns:mc="http://schemas.openxmlformats.org/markup-compatibility/2006" xmlns:o="urn:schemas-microsoft-com:office:office" xmlns:r="http://schemas.openxmlformats.org/officeDocument/2006/relationships" xmlns:m="http://schemas.openxmlformats.org/officeDocument/2006/math" xmlns:v="urn:schemas-microsoft-com:vml" xmlns:wp14="http://schemas.microsoft.com/office/word/2010/wordprocessingDrawing" xmlns:wp="http://schemas.openxmlformats.org/drawingml/2006/wordprocessingDrawing" xmlns:w10="urn:schemas-microsoft-com:office:word" xmlns:w="http://schemas.openxmlformats.org/wordprocessingml/2006/main" xmlns:w14="http://schemas.microsoft.com/office/word/2010/wordml" xmlns:w15="http://schemas.microsoft.com/office/word/2012/wordml" xmlns:w16se="http://schemas.microsoft.com/office/word/2015/wordml/symex" xmlns:wpg="http://schemas.microsoft.com/office/word/2010/wordprocessingGroup" xmlns:wpi="http://schemas.microsoft.com/office/word/2010/wordprocessingInk" xmlns:wne="http://schemas.microsoft.com/office/word/2006/wordml" xmlns:wps="http://schemas.microsoft.com/office/word/2010/wordprocessingShape" mc:Ignorable="w14 w15 w16se wp14">
+<w:footnotes xmlns:wpc="http://schemas.microsoft.com/office/word/2010/wordprocessingCanvas" xmlns:cx="http://schemas.microsoft.com/office/drawing/2014/chartex" xmlns:cx1="http://schemas.microsoft.com/office/drawing/2015/9/8/chartex" xmlns:cx2="http://schemas.microsoft.com/office/drawing/2015/10/21/chartex" xmlns:cx3="http://schemas.microsoft.com/office/drawing/2016/5/9/chartex" xmlns:cx4="http://schemas.microsoft.com/office/drawing/2016/5/10/chartex" xmlns:cx5="http://schemas.microsoft.com/office/drawing/2016/5/11/chartex" xmlns:cx6="http://schemas.microsoft.com/office/drawing/2016/5/12/chartex" xmlns:cx7="http://schemas.microsoft.com/office/drawing/2016/5/13/chartex" xmlns:cx8="http://schemas.microsoft.com/office/drawing/2016/5/14/chartex" xmlns:mc="http://schemas.openxmlformats.org/markup-compatibility/2006" xmlns:aink="http://schemas.microsoft.com/office/drawing/2016/ink" xmlns:am3d="http://schemas.microsoft.com/office/drawing/2017/model3d" xmlns:o="urn:schemas-microsoft-com:office:office" xmlns:r="http://schemas.openxmlformats.org/officeDocument/2006/relationships" xmlns:m="http://schemas.openxmlformats.org/officeDocument/2006/math" xmlns:v="urn:schemas-microsoft-com:vml" xmlns:wp14="http://schemas.microsoft.com/office/word/2010/wordprocessingDrawing" xmlns:wp="http://schemas.openxmlformats.org/drawingml/2006/wordprocessingDrawing" xmlns:w10="urn:schemas-microsoft-com:office:word" xmlns:w="http://schemas.openxmlformats.org/wordprocessingml/2006/main" xmlns:w14="http://schemas.microsoft.com/office/word/2010/wordml" xmlns:w15="http://schemas.microsoft.com/office/word/2012/wordml" xmlns:w16cex="http://schemas.microsoft.com/office/word/2018/wordml/cex" xmlns:w16cid="http://schemas.microsoft.com/office/word/2016/wordml/cid" xmlns:w16="http://schemas.microsoft.com/office/word/2018/wordml" xmlns:w16sdtdh="http://schemas.microsoft.com/office/word/2020/wordml/sdtdatahash" xmlns:w16se="http://schemas.microsoft.com/office/word/2015/wordml/symex" xmlns:wpg="http://schemas.microsoft.com/office/word/2010/wordprocessingGroup" xmlns:wpi="http://schemas.microsoft.com/office/word/2010/wordprocessingInk" xmlns:wne="http://schemas.microsoft.com/office/word/2006/wordml" xmlns:wps="http://schemas.microsoft.com/office/word/2010/wordprocessingShape" mc:Ignorable="w14 w15 w16se w16cid w16 w16cex w16sdtdh wp14">
   <w:footnote w:type="separator" w:id="-1">
     <w:p>
       <w:r>
@@ -4586,7 +5257,7 @@
 </file>
 
 <file path=word/header1.xml><?xml version="1.0" encoding="utf-8"?>
-<w:hdr xmlns:wpc="http://schemas.microsoft.com/office/word/2010/wordprocessingCanvas" xmlns:cx="http://schemas.microsoft.com/office/drawing/2014/chartex" xmlns:mc="http://schemas.openxmlformats.org/markup-compatibility/2006" xmlns:o="urn:schemas-microsoft-com:office:office" xmlns:r="http://schemas.openxmlformats.org/officeDocument/2006/relationships" xmlns:m="http://schemas.openxmlformats.org/officeDocument/2006/math" xmlns:v="urn:schemas-microsoft-com:vml" xmlns:wp14="http://schemas.microsoft.com/office/word/2010/wordprocessingDrawing" xmlns:wp="http://schemas.openxmlformats.org/drawingml/2006/wordprocessingDrawing" xmlns:w10="urn:schemas-microsoft-com:office:word" xmlns:w="http://schemas.openxmlformats.org/wordprocessingml/2006/main" xmlns:w14="http://schemas.microsoft.com/office/word/2010/wordml" xmlns:w15="http://schemas.microsoft.com/office/word/2012/wordml" xmlns:w16se="http://schemas.microsoft.com/office/word/2015/wordml/symex" xmlns:wpg="http://schemas.microsoft.com/office/word/2010/wordprocessingGroup" xmlns:wpi="http://schemas.microsoft.com/office/word/2010/wordprocessingInk" xmlns:wne="http://schemas.microsoft.com/office/word/2006/wordml" xmlns:wps="http://schemas.microsoft.com/office/word/2010/wordprocessingShape" mc:Ignorable="w14 w15 w16se wp14">
+<w:hdr xmlns:wpc="http://schemas.microsoft.com/office/word/2010/wordprocessingCanvas" xmlns:cx="http://schemas.microsoft.com/office/drawing/2014/chartex" xmlns:cx1="http://schemas.microsoft.com/office/drawing/2015/9/8/chartex" xmlns:cx2="http://schemas.microsoft.com/office/drawing/2015/10/21/chartex" xmlns:cx3="http://schemas.microsoft.com/office/drawing/2016/5/9/chartex" xmlns:cx4="http://schemas.microsoft.com/office/drawing/2016/5/10/chartex" xmlns:cx5="http://schemas.microsoft.com/office/drawing/2016/5/11/chartex" xmlns:cx6="http://schemas.microsoft.com/office/drawing/2016/5/12/chartex" xmlns:cx7="http://schemas.microsoft.com/office/drawing/2016/5/13/chartex" xmlns:cx8="http://schemas.microsoft.com/office/drawing/2016/5/14/chartex" xmlns:mc="http://schemas.openxmlformats.org/markup-compatibility/2006" xmlns:aink="http://schemas.microsoft.com/office/drawing/2016/ink" xmlns:am3d="http://schemas.microsoft.com/office/drawing/2017/model3d" xmlns:o="urn:schemas-microsoft-com:office:office" xmlns:r="http://schemas.openxmlformats.org/officeDocument/2006/relationships" xmlns:m="http://schemas.openxmlformats.org/officeDocument/2006/math" xmlns:v="urn:schemas-microsoft-com:vml" xmlns:wp14="http://schemas.microsoft.com/office/word/2010/wordprocessingDrawing" xmlns:wp="http://schemas.openxmlformats.org/drawingml/2006/wordprocessingDrawing" xmlns:w10="urn:schemas-microsoft-com:office:word" xmlns:w="http://schemas.openxmlformats.org/wordprocessingml/2006/main" xmlns:w14="http://schemas.microsoft.com/office/word/2010/wordml" xmlns:w15="http://schemas.microsoft.com/office/word/2012/wordml" xmlns:w16cex="http://schemas.microsoft.com/office/word/2018/wordml/cex" xmlns:w16cid="http://schemas.microsoft.com/office/word/2016/wordml/cid" xmlns:w16="http://schemas.microsoft.com/office/word/2018/wordml" xmlns:w16sdtdh="http://schemas.microsoft.com/office/word/2020/wordml/sdtdatahash" xmlns:w16se="http://schemas.microsoft.com/office/word/2015/wordml/symex" xmlns:wpg="http://schemas.microsoft.com/office/word/2010/wordprocessingGroup" xmlns:wpi="http://schemas.microsoft.com/office/word/2010/wordprocessingInk" xmlns:wne="http://schemas.microsoft.com/office/word/2006/wordml" xmlns:wps="http://schemas.microsoft.com/office/word/2010/wordprocessingShape" mc:Ignorable="w14 w15 w16se w16cid w16 w16cex w16sdtdh wp14">
   <w:p>
     <w:pPr>
       <w:pStyle w:val="Encabezado"/>
@@ -4683,7 +5354,7 @@
 </file>
 
 <file path=word/numbering.xml><?xml version="1.0" encoding="utf-8"?>
-<w:numbering xmlns:wpc="http://schemas.microsoft.com/office/word/2010/wordprocessingCanvas" xmlns:cx="http://schemas.microsoft.com/office/drawing/2014/chartex" xmlns:mc="http://schemas.openxmlformats.org/markup-compatibility/2006" xmlns:o="urn:schemas-microsoft-com:office:office" xmlns:r="http://schemas.openxmlformats.org/officeDocument/2006/relationships" xmlns:m="http://schemas.openxmlformats.org/officeDocument/2006/math" xmlns:v="urn:schemas-microsoft-com:vml" xmlns:wp14="http://schemas.microsoft.com/office/word/2010/wordprocessingDrawing" xmlns:wp="http://schemas.openxmlformats.org/drawingml/2006/wordprocessingDrawing" xmlns:w10="urn:schemas-microsoft-com:office:word" xmlns:w="http://schemas.openxmlformats.org/wordprocessingml/2006/main" xmlns:w14="http://schemas.microsoft.com/office/word/2010/wordml" xmlns:w15="http://schemas.microsoft.com/office/word/2012/wordml" xmlns:w16se="http://schemas.microsoft.com/office/word/2015/wordml/symex" xmlns:wpg="http://schemas.microsoft.com/office/word/2010/wordprocessingGroup" xmlns:wpi="http://schemas.microsoft.com/office/word/2010/wordprocessingInk" xmlns:wne="http://schemas.microsoft.com/office/word/2006/wordml" xmlns:wps="http://schemas.microsoft.com/office/word/2010/wordprocessingShape" mc:Ignorable="w14 w15 w16se wp14">
+<w:numbering xmlns:wpc="http://schemas.microsoft.com/office/word/2010/wordprocessingCanvas" xmlns:cx="http://schemas.microsoft.com/office/drawing/2014/chartex" xmlns:cx1="http://schemas.microsoft.com/office/drawing/2015/9/8/chartex" xmlns:cx2="http://schemas.microsoft.com/office/drawing/2015/10/21/chartex" xmlns:cx3="http://schemas.microsoft.com/office/drawing/2016/5/9/chartex" xmlns:cx4="http://schemas.microsoft.com/office/drawing/2016/5/10/chartex" xmlns:cx5="http://schemas.microsoft.com/office/drawing/2016/5/11/chartex" xmlns:cx6="http://schemas.microsoft.com/office/drawing/2016/5/12/chartex" xmlns:cx7="http://schemas.microsoft.com/office/drawing/2016/5/13/chartex" xmlns:cx8="http://schemas.microsoft.com/office/drawing/2016/5/14/chartex" xmlns:mc="http://schemas.openxmlformats.org/markup-compatibility/2006" xmlns:aink="http://schemas.microsoft.com/office/drawing/2016/ink" xmlns:am3d="http://schemas.microsoft.com/office/drawing/2017/model3d" xmlns:o="urn:schemas-microsoft-com:office:office" xmlns:r="http://schemas.openxmlformats.org/officeDocument/2006/relationships" xmlns:m="http://schemas.openxmlformats.org/officeDocument/2006/math" xmlns:v="urn:schemas-microsoft-com:vml" xmlns:wp14="http://schemas.microsoft.com/office/word/2010/wordprocessingDrawing" xmlns:wp="http://schemas.openxmlformats.org/drawingml/2006/wordprocessingDrawing" xmlns:w10="urn:schemas-microsoft-com:office:word" xmlns:w="http://schemas.openxmlformats.org/wordprocessingml/2006/main" xmlns:w14="http://schemas.microsoft.com/office/word/2010/wordml" xmlns:w15="http://schemas.microsoft.com/office/word/2012/wordml" xmlns:w16cex="http://schemas.microsoft.com/office/word/2018/wordml/cex" xmlns:w16cid="http://schemas.microsoft.com/office/word/2016/wordml/cid" xmlns:w16="http://schemas.microsoft.com/office/word/2018/wordml" xmlns:w16sdtdh="http://schemas.microsoft.com/office/word/2020/wordml/sdtdatahash" xmlns:w16se="http://schemas.microsoft.com/office/word/2015/wordml/symex" xmlns:wpg="http://schemas.microsoft.com/office/word/2010/wordprocessingGroup" xmlns:wpi="http://schemas.microsoft.com/office/word/2010/wordprocessingInk" xmlns:wne="http://schemas.microsoft.com/office/word/2006/wordml" xmlns:wps="http://schemas.microsoft.com/office/word/2010/wordprocessingShape" mc:Ignorable="w14 w15 w16se w16cid w16 w16cex w16sdtdh wp14">
   <w:abstractNum w:abstractNumId="0" w15:restartNumberingAfterBreak="0">
     <w:nsid w:val="00375C76"/>
     <w:multiLevelType w:val="multilevel"/>
@@ -9840,112 +10511,112 @@
       </w:rPr>
     </w:lvl>
   </w:abstractNum>
-  <w:num w:numId="1">
+  <w:num w:numId="1" w16cid:durableId="2081516077">
     <w:abstractNumId w:val="15"/>
   </w:num>
-  <w:num w:numId="2">
+  <w:num w:numId="2" w16cid:durableId="841238046">
     <w:abstractNumId w:val="9"/>
   </w:num>
-  <w:num w:numId="3">
+  <w:num w:numId="3" w16cid:durableId="1072046682">
     <w:abstractNumId w:val="16"/>
   </w:num>
-  <w:num w:numId="4">
+  <w:num w:numId="4" w16cid:durableId="1329136758">
     <w:abstractNumId w:val="1"/>
   </w:num>
-  <w:num w:numId="5">
+  <w:num w:numId="5" w16cid:durableId="171335868">
     <w:abstractNumId w:val="30"/>
   </w:num>
-  <w:num w:numId="6">
+  <w:num w:numId="6" w16cid:durableId="1441298149">
     <w:abstractNumId w:val="28"/>
   </w:num>
-  <w:num w:numId="7">
+  <w:num w:numId="7" w16cid:durableId="1727141734">
     <w:abstractNumId w:val="5"/>
   </w:num>
-  <w:num w:numId="8">
+  <w:num w:numId="8" w16cid:durableId="254216521">
     <w:abstractNumId w:val="10"/>
   </w:num>
-  <w:num w:numId="9">
+  <w:num w:numId="9" w16cid:durableId="1095783002">
     <w:abstractNumId w:val="21"/>
   </w:num>
-  <w:num w:numId="10">
+  <w:num w:numId="10" w16cid:durableId="1843422985">
     <w:abstractNumId w:val="22"/>
   </w:num>
-  <w:num w:numId="11">
+  <w:num w:numId="11" w16cid:durableId="1822846119">
     <w:abstractNumId w:val="0"/>
   </w:num>
-  <w:num w:numId="12">
+  <w:num w:numId="12" w16cid:durableId="2079278929">
     <w:abstractNumId w:val="23"/>
   </w:num>
-  <w:num w:numId="13">
+  <w:num w:numId="13" w16cid:durableId="271208545">
     <w:abstractNumId w:val="4"/>
   </w:num>
-  <w:num w:numId="14">
+  <w:num w:numId="14" w16cid:durableId="1429961241">
     <w:abstractNumId w:val="11"/>
   </w:num>
-  <w:num w:numId="15">
+  <w:num w:numId="15" w16cid:durableId="1871841954">
     <w:abstractNumId w:val="33"/>
   </w:num>
-  <w:num w:numId="16">
+  <w:num w:numId="16" w16cid:durableId="1458334637">
     <w:abstractNumId w:val="2"/>
   </w:num>
-  <w:num w:numId="17">
+  <w:num w:numId="17" w16cid:durableId="428814397">
     <w:abstractNumId w:val="17"/>
   </w:num>
-  <w:num w:numId="18">
+  <w:num w:numId="18" w16cid:durableId="2038307251">
     <w:abstractNumId w:val="18"/>
   </w:num>
-  <w:num w:numId="19">
+  <w:num w:numId="19" w16cid:durableId="482357893">
     <w:abstractNumId w:val="3"/>
   </w:num>
-  <w:num w:numId="20">
+  <w:num w:numId="20" w16cid:durableId="2131432624">
     <w:abstractNumId w:val="20"/>
   </w:num>
-  <w:num w:numId="21">
+  <w:num w:numId="21" w16cid:durableId="1976255522">
     <w:abstractNumId w:val="7"/>
   </w:num>
-  <w:num w:numId="22">
+  <w:num w:numId="22" w16cid:durableId="1353533420">
     <w:abstractNumId w:val="13"/>
   </w:num>
-  <w:num w:numId="23">
+  <w:num w:numId="23" w16cid:durableId="1420716896">
     <w:abstractNumId w:val="29"/>
   </w:num>
-  <w:num w:numId="24">
+  <w:num w:numId="24" w16cid:durableId="1829905969">
     <w:abstractNumId w:val="27"/>
   </w:num>
-  <w:num w:numId="25">
+  <w:num w:numId="25" w16cid:durableId="11077323">
     <w:abstractNumId w:val="24"/>
   </w:num>
-  <w:num w:numId="26">
+  <w:num w:numId="26" w16cid:durableId="1883009990">
     <w:abstractNumId w:val="8"/>
   </w:num>
-  <w:num w:numId="27">
+  <w:num w:numId="27" w16cid:durableId="2059233944">
     <w:abstractNumId w:val="31"/>
   </w:num>
-  <w:num w:numId="28">
+  <w:num w:numId="28" w16cid:durableId="940065498">
     <w:abstractNumId w:val="35"/>
   </w:num>
-  <w:num w:numId="29">
+  <w:num w:numId="29" w16cid:durableId="247273154">
     <w:abstractNumId w:val="6"/>
   </w:num>
-  <w:num w:numId="30">
+  <w:num w:numId="30" w16cid:durableId="1835878497">
     <w:abstractNumId w:val="25"/>
   </w:num>
-  <w:num w:numId="31">
+  <w:num w:numId="31" w16cid:durableId="1196579005">
     <w:abstractNumId w:val="32"/>
   </w:num>
-  <w:num w:numId="32">
+  <w:num w:numId="32" w16cid:durableId="1490368487">
     <w:abstractNumId w:val="26"/>
   </w:num>
-  <w:num w:numId="33">
+  <w:num w:numId="33" w16cid:durableId="1949115014">
     <w:abstractNumId w:val="19"/>
   </w:num>
-  <w:num w:numId="34">
+  <w:num w:numId="34" w16cid:durableId="834762943">
     <w:abstractNumId w:val="12"/>
   </w:num>
-  <w:num w:numId="35">
+  <w:num w:numId="35" w16cid:durableId="1590037332">
     <w:abstractNumId w:val="14"/>
   </w:num>
-  <w:num w:numId="36">
+  <w:num w:numId="36" w16cid:durableId="826439455">
     <w:abstractNumId w:val="34"/>
   </w:num>
   <w:numIdMacAtCleanup w:val="36"/>
@@ -9953,7 +10624,7 @@
 </file>
 
 <file path=word/styles.xml><?xml version="1.0" encoding="utf-8"?>
-<w:styles xmlns:mc="http://schemas.openxmlformats.org/markup-compatibility/2006" xmlns:r="http://schemas.openxmlformats.org/officeDocument/2006/relationships" xmlns:w="http://schemas.openxmlformats.org/wordprocessingml/2006/main" xmlns:w14="http://schemas.microsoft.com/office/word/2010/wordml" xmlns:w15="http://schemas.microsoft.com/office/word/2012/wordml" xmlns:w16se="http://schemas.microsoft.com/office/word/2015/wordml/symex" mc:Ignorable="w14 w15 w16se">
+<w:styles xmlns:mc="http://schemas.openxmlformats.org/markup-compatibility/2006" xmlns:r="http://schemas.openxmlformats.org/officeDocument/2006/relationships" xmlns:w="http://schemas.openxmlformats.org/wordprocessingml/2006/main" xmlns:w14="http://schemas.microsoft.com/office/word/2010/wordml" xmlns:w15="http://schemas.microsoft.com/office/word/2012/wordml" xmlns:w16cex="http://schemas.microsoft.com/office/word/2018/wordml/cex" xmlns:w16cid="http://schemas.microsoft.com/office/word/2016/wordml/cid" xmlns:w16="http://schemas.microsoft.com/office/word/2018/wordml" xmlns:w16sdtdh="http://schemas.microsoft.com/office/word/2020/wordml/sdtdatahash" xmlns:w16se="http://schemas.microsoft.com/office/word/2015/wordml/symex" mc:Ignorable="w14 w15 w16se w16cid w16 w16cex w16sdtdh">
   <w:docDefaults>
     <w:rPrDefault>
       <w:rPr>
@@ -9971,7 +10642,7 @@
       </w:pPr>
     </w:pPrDefault>
   </w:docDefaults>
-  <w:latentStyles w:defLockedState="0" w:defUIPriority="99" w:defSemiHidden="0" w:defUnhideWhenUsed="0" w:defQFormat="0" w:count="371">
+  <w:latentStyles w:defLockedState="0" w:defUIPriority="99" w:defSemiHidden="0" w:defUnhideWhenUsed="0" w:defQFormat="0" w:count="376">
     <w:lsdException w:name="Normal" w:uiPriority="0" w:qFormat="1"/>
     <w:lsdException w:name="heading 1" w:uiPriority="9" w:qFormat="1"/>
     <w:lsdException w:name="heading 2" w:semiHidden="1" w:uiPriority="9" w:unhideWhenUsed="1" w:qFormat="1"/>
@@ -10077,7 +10748,6 @@
     <w:lsdException w:name="HTML Sample" w:semiHidden="1" w:unhideWhenUsed="1"/>
     <w:lsdException w:name="HTML Typewriter" w:semiHidden="1" w:unhideWhenUsed="1"/>
     <w:lsdException w:name="HTML Variable" w:semiHidden="1" w:unhideWhenUsed="1"/>
-    <w:lsdException w:name="Normal Table" w:semiHidden="1" w:unhideWhenUsed="1"/>
     <w:lsdException w:name="annotation subject" w:semiHidden="1" w:unhideWhenUsed="1"/>
     <w:lsdException w:name="No List" w:semiHidden="1" w:unhideWhenUsed="1"/>
     <w:lsdException w:name="Outline List 1" w:semiHidden="1" w:unhideWhenUsed="1"/>
@@ -10120,11 +10790,8 @@
     <w:lsdException w:name="Table Contemporary" w:semiHidden="1" w:unhideWhenUsed="1"/>
     <w:lsdException w:name="Table Elegant" w:semiHidden="1" w:unhideWhenUsed="1"/>
     <w:lsdException w:name="Table Professional" w:semiHidden="1" w:unhideWhenUsed="1"/>
-    <w:lsdException w:name="Table Subtle 1" w:semiHidden="1" w:unhideWhenUsed="1"/>
     <w:lsdException w:name="Table Subtle 2" w:semiHidden="1" w:unhideWhenUsed="1"/>
     <w:lsdException w:name="Table Web 1" w:semiHidden="1" w:unhideWhenUsed="1"/>
-    <w:lsdException w:name="Table Web 2" w:semiHidden="1" w:unhideWhenUsed="1"/>
-    <w:lsdException w:name="Table Web 3" w:semiHidden="1" w:unhideWhenUsed="1"/>
     <w:lsdException w:name="Balloon Text" w:semiHidden="1" w:unhideWhenUsed="1"/>
     <w:lsdException w:name="Table Grid" w:uiPriority="39"/>
     <w:lsdException w:name="Table Theme" w:semiHidden="1" w:unhideWhenUsed="1"/>
@@ -10343,6 +11010,11 @@
     <w:lsdException w:name="List Table 5 Dark Accent 6" w:uiPriority="50"/>
     <w:lsdException w:name="List Table 6 Colorful Accent 6" w:uiPriority="51"/>
     <w:lsdException w:name="List Table 7 Colorful Accent 6" w:uiPriority="52"/>
+    <w:lsdException w:name="Mention" w:semiHidden="1" w:unhideWhenUsed="1"/>
+    <w:lsdException w:name="Smart Hyperlink" w:semiHidden="1" w:unhideWhenUsed="1"/>
+    <w:lsdException w:name="Hashtag" w:semiHidden="1" w:unhideWhenUsed="1"/>
+    <w:lsdException w:name="Unresolved Mention" w:semiHidden="1" w:unhideWhenUsed="1"/>
+    <w:lsdException w:name="Smart Link" w:semiHidden="1" w:unhideWhenUsed="1"/>
   </w:latentStyles>
   <w:style w:type="paragraph" w:default="1" w:styleId="Normal">
     <w:name w:val="Normal"/>

</xml_diff>